<commit_message>
doc: compile and save final Chapter 2 docx with all feedback integrated
</commit_message>
<xml_diff>
--- a/Chuong_2_Cong_Nghe_Su_Dung_Final.docx
+++ b/Chuong_2_Cong_Nghe_Su_Dung_Final.docx
@@ -2,6 +2,186 @@
 <file path=word/document.xml><?xml version="1.0" encoding="utf-8"?>
 <w:document xmlns:wpc="http://schemas.microsoft.com/office/word/2010/wordprocessingCanvas" xmlns:mo="http://schemas.microsoft.com/office/mac/office/2008/main" xmlns:mc="http://schemas.openxmlformats.org/markup-compatibility/2006" xmlns:mv="urn:schemas-microsoft-com:mac:vml" xmlns:o="urn:schemas-microsoft-com:office:office" xmlns:r="http://schemas.openxmlformats.org/officeDocument/2006/relationships" xmlns:m="http://schemas.openxmlformats.org/officeDocument/2006/math" xmlns:v="urn:schemas-microsoft-com:vml" xmlns:wp14="http://schemas.microsoft.com/office/word/2010/wordprocessingDrawing" xmlns:wp="http://schemas.openxmlformats.org/drawingml/2006/wordprocessingDrawing" xmlns:w10="urn:schemas-microsoft-com:office:word" xmlns:w="http://schemas.openxmlformats.org/wordprocessingml/2006/main" xmlns:w14="http://schemas.microsoft.com/office/word/2010/wordml" xmlns:wpg="http://schemas.microsoft.com/office/word/2010/wordprocessingGroup" xmlns:wpi="http://schemas.microsoft.com/office/word/2010/wordprocessingInk" xmlns:wne="http://schemas.microsoft.com/office/word/2006/wordml" xmlns:wps="http://schemas.microsoft.com/office/word/2010/wordprocessingShape" mc:Ignorable="w14 wp14">
   <w:body>
+    <w:p>
+      <w:pPr>
+        <w:spacing w:line="360" w:lineRule="auto" w:before="0" w:after="120"/>
+        <w:jc w:val="both"/>
+      </w:pPr>
+      <w:r>
+        <w:rPr>
+          <w:rFonts w:ascii="Times New Roman" w:hAnsi="Times New Roman"/>
+          <w:b w:val="0"/>
+          <w:i w:val="0"/>
+          <w:color w:val="000000"/>
+          <w:sz w:val="26"/>
+        </w:rPr>
+        <w:t xml:space="preserve">1. </w:t>
+      </w:r>
+      <w:r>
+        <w:rPr>
+          <w:rFonts w:ascii="Times New Roman" w:hAnsi="Times New Roman"/>
+          <w:b w:val="0"/>
+          <w:i w:val="0"/>
+          <w:color w:val="000000"/>
+          <w:sz w:val="26"/>
+        </w:rPr>
+        <w:t>Lớp giao diện (Frontend) chứa Vercel:</w:t>
+      </w:r>
+      <w:r>
+        <w:rPr>
+          <w:rFonts w:ascii="Times New Roman" w:hAnsi="Times New Roman"/>
+          <w:b w:val="0"/>
+          <w:i w:val="0"/>
+          <w:color w:val="000000"/>
+          <w:sz w:val="26"/>
+        </w:rPr>
+        <w:t xml:space="preserve"> Vercel nằm ở mục 2.1.5 ngay trong Frontend.</w:t>
+      </w:r>
+    </w:p>
+    <w:p>
+      <w:pPr>
+        <w:spacing w:line="360" w:lineRule="auto" w:before="0" w:after="120"/>
+        <w:jc w:val="both"/>
+      </w:pPr>
+      <w:r>
+        <w:rPr>
+          <w:rFonts w:ascii="Times New Roman" w:hAnsi="Times New Roman"/>
+          <w:b w:val="0"/>
+          <w:i w:val="0"/>
+          <w:color w:val="000000"/>
+          <w:sz w:val="26"/>
+        </w:rPr>
+        <w:t xml:space="preserve">2. </w:t>
+      </w:r>
+      <w:r>
+        <w:rPr>
+          <w:rFonts w:ascii="Times New Roman" w:hAnsi="Times New Roman"/>
+          <w:b w:val="0"/>
+          <w:i w:val="0"/>
+          <w:color w:val="000000"/>
+          <w:sz w:val="26"/>
+        </w:rPr>
+        <w:t>Không có Gemini AI:</w:t>
+      </w:r>
+      <w:r>
+        <w:rPr>
+          <w:rFonts w:ascii="Times New Roman" w:hAnsi="Times New Roman"/>
+          <w:b w:val="0"/>
+          <w:i w:val="0"/>
+          <w:color w:val="000000"/>
+          <w:sz w:val="26"/>
+        </w:rPr>
+        <w:t xml:space="preserve"> Giữ cấu trúc 5 lớp chính không nhắc tới Gemini AI.</w:t>
+      </w:r>
+    </w:p>
+    <w:p>
+      <w:pPr>
+        <w:spacing w:line="360" w:lineRule="auto" w:before="0" w:after="120"/>
+        <w:jc w:val="both"/>
+      </w:pPr>
+      <w:r>
+        <w:rPr>
+          <w:rFonts w:ascii="Times New Roman" w:hAnsi="Times New Roman"/>
+          <w:b w:val="0"/>
+          <w:i w:val="0"/>
+          <w:color w:val="000000"/>
+          <w:sz w:val="26"/>
+        </w:rPr>
+        <w:t xml:space="preserve">3. </w:t>
+      </w:r>
+      <w:r>
+        <w:rPr>
+          <w:rFonts w:ascii="Times New Roman" w:hAnsi="Times New Roman"/>
+          <w:b w:val="0"/>
+          <w:i w:val="0"/>
+          <w:color w:val="000000"/>
+          <w:sz w:val="26"/>
+        </w:rPr>
+        <w:t>So sánh PostgreSQL &amp; MongoDB:</w:t>
+      </w:r>
+      <w:r>
+        <w:rPr>
+          <w:rFonts w:ascii="Times New Roman" w:hAnsi="Times New Roman"/>
+          <w:b w:val="0"/>
+          <w:i w:val="0"/>
+          <w:color w:val="000000"/>
+          <w:sz w:val="26"/>
+        </w:rPr>
+        <w:t xml:space="preserve"> Làm nổi bật ưu điểm của cả hai và cơ chế khóa dòng `SELECT FOR UPDATE` thực tế chống race condition ví tiền.</w:t>
+      </w:r>
+    </w:p>
+    <w:p>
+      <w:pPr>
+        <w:spacing w:line="360" w:lineRule="auto" w:before="0" w:after="120"/>
+        <w:jc w:val="both"/>
+      </w:pPr>
+      <w:r>
+        <w:rPr>
+          <w:rFonts w:ascii="Times New Roman" w:hAnsi="Times New Roman"/>
+          <w:b w:val="0"/>
+          <w:i w:val="0"/>
+          <w:color w:val="000000"/>
+          <w:sz w:val="26"/>
+        </w:rPr>
+        <w:t xml:space="preserve">4. </w:t>
+      </w:r>
+      <w:r>
+        <w:rPr>
+          <w:rFonts w:ascii="Times New Roman" w:hAnsi="Times New Roman"/>
+          <w:b w:val="0"/>
+          <w:i w:val="0"/>
+          <w:color w:val="000000"/>
+          <w:sz w:val="26"/>
+        </w:rPr>
+        <w:t>Lưu trữ ảnh cục bộ:</w:t>
+      </w:r>
+      <w:r>
+        <w:rPr>
+          <w:rFonts w:ascii="Times New Roman" w:hAnsi="Times New Roman"/>
+          <w:b w:val="0"/>
+          <w:i w:val="0"/>
+          <w:color w:val="000000"/>
+          <w:sz w:val="26"/>
+        </w:rPr>
+        <w:t xml:space="preserve"> Nêu rõ ảnh được lưu trên ổ đĩa của Render backend và là giải pháp tạm thời do ổ đĩa của Render Free tier có tính tạm thời (ephemeral storage).</w:t>
+      </w:r>
+    </w:p>
+    <w:p>
+      <w:pPr>
+        <w:spacing w:line="360" w:lineRule="auto" w:before="0" w:after="120"/>
+        <w:jc w:val="both"/>
+      </w:pPr>
+      <w:r>
+        <w:rPr>
+          <w:rFonts w:ascii="Times New Roman" w:hAnsi="Times New Roman"/>
+          <w:b w:val="0"/>
+          <w:i w:val="0"/>
+          <w:color w:val="000000"/>
+          <w:sz w:val="26"/>
+        </w:rPr>
+        <w:t xml:space="preserve">5. </w:t>
+      </w:r>
+      <w:r>
+        <w:rPr>
+          <w:rFonts w:ascii="Times New Roman" w:hAnsi="Times New Roman"/>
+          <w:b w:val="0"/>
+          <w:i w:val="0"/>
+          <w:color w:val="000000"/>
+          <w:sz w:val="26"/>
+        </w:rPr>
+        <w:t>Git, Figma, Postman, Docker:</w:t>
+      </w:r>
+      <w:r>
+        <w:rPr>
+          <w:rFonts w:ascii="Times New Roman" w:hAnsi="Times New Roman"/>
+          <w:b w:val="0"/>
+          <w:i w:val="0"/>
+          <w:color w:val="000000"/>
+          <w:sz w:val="26"/>
+        </w:rPr>
+        <w:t xml:space="preserve"> Chỉnh sửa văn phong chủ động, giải nghĩa Docker và Postman trong dự án.</w:t>
+      </w:r>
+    </w:p>
     <w:p>
       <w:pPr>
         <w:spacing w:line="360" w:lineRule="auto" w:before="240" w:after="360"/>
@@ -31,7 +211,7 @@
           <w:color w:val="000000"/>
           <w:sz w:val="26"/>
         </w:rPr>
-        <w:t>Sau quá trình tìm kiếm, nghiên cứu và tham khảo các tài liệu chuyên ngành, nhóm phát triển xác định được một khung cơ sở lý thuyết về cấu trúc web tiêu chuẩn là mô hình kiến trúc Web 3 lớp truyền thống (3-Tier Architecture). Khung cơ sở lý thuyết này bao gồm các thành phần chính là lớp trình diễn (Presentation Layer), lớp logic nghiệp vụ (Application Layer) và lớp dữ liệu (Data Layer).</w:t>
+        <w:t>Sau quá trình học tập, tìm kiếm tài liệu và tham khảo cấu trúc các trang web thực tế, nhóm quyết định lựa chọn "Mô hình Kiến trúc Web 3 Lớp kết hợp Dịch vụ RESTful và Cơ sở Dữ liệu Lai" làm nền tảng định hướng thiết kế hệ thống. Nhóm lựa chọn kiến trúc này vì nó giúp tách biệt rõ ràng 3 phần độc lập: lớp giao diện người dùng (Presentation Layer), lớp logic nghiệp vụ (Application Layer) và lớp cơ sở dữ liệu (Data Layer). Sự phân rã này mang lại tính liền mạch cho dự án, giúp các thành viên có thể phát triển giao diện độc lập mà không ảnh hưởng tới dữ liệu ở backend, đồng thời giúp việc tìm kiếm lỗi và bảo trì các chức năng (như ví điện tử hay lên lịch trình) diễn ra dễ dàng hơn rất nhiều.</w:t>
       </w:r>
     </w:p>
     <w:p>
@@ -47,27 +227,7 @@
           <w:color w:val="000000"/>
           <w:sz w:val="26"/>
         </w:rPr>
-        <w:t xml:space="preserve">Nhóm quyết định lựa chọn và cải tiến mô hình này thành </w:t>
-      </w:r>
-      <w:r>
-        <w:rPr>
-          <w:rFonts w:ascii="Times New Roman" w:hAnsi="Times New Roman"/>
-          <w:b w:val="0"/>
-          <w:i w:val="0"/>
-          <w:color w:val="000000"/>
-          <w:sz w:val="26"/>
-        </w:rPr>
-        <w:t>"Mô hình Kiến trúc Web 3 Lớp kết hợp Dịch vụ RESTful và Cơ sở Dữ liệu Lai"</w:t>
-      </w:r>
-      <w:r>
-        <w:rPr>
-          <w:rFonts w:ascii="Times New Roman" w:hAnsi="Times New Roman"/>
-          <w:b w:val="0"/>
-          <w:i w:val="0"/>
-          <w:color w:val="000000"/>
-          <w:sz w:val="26"/>
-        </w:rPr>
-        <w:t xml:space="preserve"> (3-Tier Web Architecture with RESTful Services and Hybrid Relational-Document Database Framework) nhằm đảm bảo sự đồng nhất tuyệt đối với mục tiêu tối ưu hóa trải nghiệm người dùng, phù hợp với phạm vi phát triển sản phẩm du lịch sinh thái và khả năng kỹ thuật thực tế của nhóm. Sau đây là thông tin chi tiết về cấu trúc kiến trúc định hướng và các công nghệ cụ thể được nhóm lựa chọn sử dụng trong hệ thống.</w:t>
+        <w:t>Sau đây là chi tiết về cấu trúc và công nghệ mà nhóm lựa chọn sử dụng trong hệ thống:</w:t>
       </w:r>
     </w:p>
     <w:p>
@@ -270,7 +430,7 @@
           <w:color w:val="000000"/>
           <w:sz w:val="26"/>
         </w:rPr>
-        <w:t>Đối với chức năng bản đồ hành trình, nhóm thiết kế tích hợp bộ đôi thư viện bản đồ Leaflet kết hợp nguồn OpenStreetMap vào màn hình thiết lập lịch trình du lịch. Bản đồ sẽ được khởi tạo trực quan trên màn hình, tự động gửi yêu cầu tải bản đồ từ OpenStreetMap để hiển thị lộ trình. Khi người dùng thêm điểm dừng chân, Leaflet sẽ tạo marker dựa trên tọa độ vĩ độ và kinh độ thực tế và vẽ tuyến đường lộ trình di chuyển.</w:t>
+        <w:t>Đối với chức năng bản đồ hành trình, ban đầu nhóm rất muốn tích hợp Google Maps API để đạt được sự tiện lợi tối đa trong việc tìm kiếm điểm đến, tính toán đường đi uốn lượn và tham khảo kho địa danh phong phú tại Việt Nam. Tuy nhiên, việc sử dụng Google Maps API đòi hỏi nhóm phải liên kết thẻ tín dụng quốc tế để thanh toán chi phí phát sinh hàng tháng, đây là một hạn chế lớn về mặt kinh phí đối với đề tài sinh viên.</w:t>
       </w:r>
     </w:p>
     <w:p>
@@ -286,23 +446,7 @@
           <w:color w:val="000000"/>
           <w:sz w:val="26"/>
         </w:rPr>
-        <w:t>Để tối ưu hóa luồng di chuyển và hiển thị chính xác lượng carbon giảm thiểu, chúng tôi đề xuất và thực tế tích hợp bổ sung công cụ OSRM (Open Source Routing Machine) kết hợp với Leaflet. OSRM cung cấp dịch vụ tính toán đường đi ngắn nhất dựa trên mạng lưới đường bộ thực tế của OpenStreetMap. Thay vì chỉ vẽ các đường thẳng nối giữa các tọa độ (vốn không phản ánh đúng thực tế di chuyển), sự kết hợp này giúp hệ thống tự động vẽ đường đi uốn lượn chính xác theo bản đồ giao thông và đo đạc khoảng cách thực tế để quy đổi lượng khí thải CO2 giảm thiểu chính xác cho hành trình du lịch xanh.</w:t>
-      </w:r>
-    </w:p>
-    <w:p>
-      <w:pPr>
-        <w:spacing w:line="360" w:lineRule="auto" w:before="0" w:after="120"/>
-        <w:jc w:val="both"/>
-      </w:pPr>
-      <w:r>
-        <w:rPr>
-          <w:rFonts w:ascii="Times New Roman" w:hAnsi="Times New Roman"/>
-          <w:b w:val="0"/>
-          <w:i w:val="0"/>
-          <w:color w:val="000000"/>
-          <w:sz w:val="26"/>
-        </w:rPr>
-        <w:t>Về định hướng lâu dài, chúng tôi xác định hệ thống cần tích hợp Google Maps API để tối ưu hóa việc tự động lập tuyến đường di chuyển thông minh và tham khảo cơ sở dữ liệu địa danh phong phú, chính xác nhất. Tuy nhiên, trong phạm vi thử nghiệm và xây dựng bản demo của đồ án hiện tại, nhóm lựa chọn sử dụng Leaflet kết hợp OpenStreetMap làm giải pháp thay thế tạm thời nhằm tiết kiệm chi phí, không phải đăng ký thẻ tín dụng quốc tế và tránh các chi phí phát sinh bất ngờ cho sinh viên.</w:t>
+        <w:t>Vì lý do đó, nhóm lựa chọn giải pháp thay thế là sử dụng thư viện bản đồ mã nguồn mở Leaflet kết hợp nguồn bản đồ miễn phí OpenStreetMap. Đồng thời, nhóm tích hợp thêm công cụ OSRM (Open Source Routing Machine) chạy ngầm để giải quyết bài toán vẽ tuyến đường di chuyển thực tế qua mạng lưới đường bộ và đo đạc khoảng cách chính xác nhằm quy đổi lượng phát thải Carbon cho mỗi chuyến đi. Phương án kết hợp này hoàn toàn miễn phí, tải nhẹ và đáp ứng đầy đủ yêu cầu mô phỏng bản đồ cho bản demo hiện tại của dự án.</w:t>
       </w:r>
     </w:p>
     <w:p>
@@ -333,23 +477,7 @@
           <w:color w:val="000000"/>
           <w:sz w:val="26"/>
         </w:rPr>
-        <w:t>Nhóm phát triển triển khai bản build tĩnh của giao diện Angular lên hạ tầng đám mây Vercel CDN để tối ưu hóa tốc độ tải trang ở các máy chủ biên gần người dùng nhất. Quy trình tự động hóa CI/CD được thiết lập thông qua liên kết Vercel với GitHub để tự động biên dịch ứng dụng mỗi khi có mã nguồn mới. Đồng thời, tệp vercel.json được cấu hình để thiết lập quy tắc chuyển hướng đường dẫn API định tuyến mọi request ảo về tệp tin index.html gốc.</w:t>
-      </w:r>
-    </w:p>
-    <w:p>
-      <w:pPr>
-        <w:spacing w:line="360" w:lineRule="auto" w:before="0" w:after="120"/>
-        <w:jc w:val="both"/>
-      </w:pPr>
-      <w:r>
-        <w:rPr>
-          <w:rFonts w:ascii="Times New Roman" w:hAnsi="Times New Roman"/>
-          <w:b w:val="0"/>
-          <w:i w:val="0"/>
-          <w:color w:val="000000"/>
-          <w:sz w:val="26"/>
-        </w:rPr>
-        <w:t>Nhóm lựa chọn Vercel vì chúng tôi đã quen thuộc với giao thức cấu hình nhanh trên nền tảng này, giúp triển khai sản phẩm tiện lợi và nhanh chóng, đồng thời đây là dịch vụ miễn phí, vô cùng phù hợp với điều kiện kinh tế của sinh viên. Vercel giải quyết triệt để lỗi 404 khi F5 tải lại trang của SPA bằng tệp cấu hình vercel.json gọn nhẹ. Các hạ tầng khác như AWS S3 có thể xử lý lỗi này nhưng vướng mắc ở chỗ phải thiết lập cấu hình chuyển hướng trang lỗi 404 về index.html (gây ra mã phản hồi HTTP 200 giả mạo trên header, không tốt cho SEO), hoặc bắt buộc lập trình viên phải trả phí viết thêm các hàm AWS Lambda tại biên để sửa đổi URL, làm tăng độ phức tạp và chi phí vận hành của đồ án.</w:t>
+        <w:t>Nhóm phát triển triển khai bản build tĩnh của giao diện Angular lên đặt tại máy chủ phân phối Vercel. Quy trình tự động hóa được thiết lập thông qua việc liên kết trực tiếp Vercel với kho mã nguồn GitHub, giúp hệ thống tự động biên dịch và cập nhật giao diện mới mỗi khi có mã code mới được push lên nhánh main. Đồng thời, nhóm tạo tệp tin vercel.json để cấu hình quy tắc viết lại đường dẫn (rewrites) trỏ mọi yêu cầu trang SPA về file index.html gốc, giúp trình duyệt khi tải lại trang (F5) không gặp lỗi 404. Nhóm lựa chọn Vercel vì công cụ này hoàn toàn miễn phí cho sinh viên, giao diện dễ thao tác và quá trình triển khai tự động diễn ra vô cùng nhanh chóng.</w:t>
       </w:r>
     </w:p>
     <w:p>
@@ -380,23 +508,7 @@
           <w:color w:val="000000"/>
           <w:sz w:val="26"/>
         </w:rPr>
-        <w:t>Nhóm phát triển sử dụng hệ thống phân giải tên miền DNS và định tuyến tích hợp sẵn của hai nền tảng đám mây Vercel và Render.com để chuyển tiếp các yêu cầu từ giao diện đến máy chủ backend. Đồng thời, nhóm thiết lập giao thức HTTPS cho toàn bộ API gọi từ tên miền giao diện greensteps.vercel.app đến backend greensteps-api.onrender.com để mã hóa bảo mật toàn bộ dữ liệu trên đường truyền, ngăn ngừa nguy cơ nghe trộm hoặc sửa đổi thông tin của người dùng.</w:t>
-      </w:r>
-    </w:p>
-    <w:p>
-      <w:pPr>
-        <w:spacing w:line="360" w:lineRule="auto" w:before="0" w:after="120"/>
-        <w:jc w:val="both"/>
-      </w:pPr>
-      <w:r>
-        <w:rPr>
-          <w:rFonts w:ascii="Times New Roman" w:hAnsi="Times New Roman"/>
-          <w:b w:val="0"/>
-          <w:i w:val="0"/>
-          <w:color w:val="000000"/>
-          <w:sz w:val="26"/>
-        </w:rPr>
-        <w:t>*(Vì quy mô người dùng thử nghiệm của đồ án nhỏ, nhóm tận dụng các tính năng cân bằng tải và định tuyến tự động được tích hợp sẵn ở tầng PaaS của nhà cung cấp để tối ưu hóa thời gian thiết lập mà không cần tự định cấu hình các máy chủ định tuyến riêng lẻ).*</w:t>
+        <w:t>Nhóm hiểu lớp mạng và điều phối này một cách đơn giản là cầu nối liên lạc giữa Frontend và Backend. Do Frontend đặt ở Vercel (greensteps.vercel.app) và Backend đặt ở Render (greensteps-api.onrender.com), nhóm sử dụng các tên miền này để Frontend có thể gửi các yêu cầu lấy hoặc ghi dữ liệu đến đúng máy chủ Backend. Toàn bộ các yêu cầu gọi từ Frontend đến Backend đều bắt buộc sử dụng giao thức bảo mật HTTPS để mã hóa thông tin truyền tải trên đường truyền, giữ an toàn tài khoản và số dư ví của người dùng. Nhóm tận dụng hệ thống định tuyến tự động của Vercel và Render để đơn giản hóa việc thiết lập mà không cần phải tự cài đặt cấu hình máy chủ mạng phức tạp.</w:t>
       </w:r>
     </w:p>
     <w:p>
@@ -804,7 +916,7 @@
           <w:color w:val="000000"/>
           <w:sz w:val="26"/>
         </w:rPr>
-        <w:t>Nhóm phát triển sử dụng đĩa cứng của máy chủ để lưu trữ trực tiếp các tệp tin hình ảnh do người dùng và đối tác tải lên.</w:t>
+        <w:t>Nhóm phát triển tận dụng ổ đĩa cứng cục bộ của máy chủ backend đặt tại Render.com để lưu trữ các hình ảnh do đối tác và người dùng tải lên.</w:t>
       </w:r>
     </w:p>
     <w:p>
@@ -821,7 +933,7 @@
           <w:color w:val="000000"/>
           <w:sz w:val="26"/>
         </w:rPr>
-        <w:t>Tổ chức thư mục lưu trữ:</w:t>
+        <w:t>Tổ chức thư mục:</w:t>
       </w:r>
       <w:r>
         <w:rPr>
@@ -831,7 +943,7 @@
           <w:color w:val="000000"/>
           <w:sz w:val="26"/>
         </w:rPr>
-        <w:t xml:space="preserve"> Toàn bộ file ảnh được lưu tập trung trong thư mục `/uploads` ở gốc dự án backend. Thư mục này được chia thành các thư mục con rõ ràng theo đối tượng: `/uploads/avatars/` chứa ảnh đại diện người dùng, `/uploads/services/` chứa ảnh các dịch vụ sinh thái và phòng nghỉ, `/uploads/posts/` chứa các hình ảnh đính kèm bài đăng trên mạng xã hội cộng đồng.</w:t>
+        <w:t xml:space="preserve"> Ảnh được lưu trực tiếp vào thư mục `/uploads` ở gốc dự án backend trên máy chủ Render. Trong đó, `/uploads/avatars/` chứa ảnh đại diện, `/uploads/services/` chứa ảnh dịch vụ, homestay và `/uploads/posts/` chứa ảnh bài đăng cộng đồng.</w:t>
       </w:r>
     </w:p>
     <w:p>
@@ -848,7 +960,7 @@
           <w:color w:val="000000"/>
           <w:sz w:val="26"/>
         </w:rPr>
-        <w:t>Cơ chế lưu trữ và hiển thị:</w:t>
+        <w:t>Cơ chế lưu trữ:</w:t>
       </w:r>
       <w:r>
         <w:rPr>
@@ -858,7 +970,7 @@
           <w:color w:val="000000"/>
           <w:sz w:val="26"/>
         </w:rPr>
-        <w:t xml:space="preserve"> Khi ảnh được upload, server lưu file vật lý vào thư mục con tương ứng, đồng thời ghi lại đường dẫn tương đối (ví dụ: `/uploads/services/img-17839.png`) vào cột cơ sở dữ liệu PostgreSQL. Tệp `src/app.js` định cấu hình middleware Express static trỏ tới thư mục uploads để cung cấp đường dẫn truy cập trực tiếp từ phía client. Chúng tôi lựa chọn giải pháp này để tối ưu chi phí và tránh phụ thuộc vào các dịch vụ lưu trữ bên thứ ba như AWS S3 hay Cloudinary.</w:t>
+        <w:t xml:space="preserve"> Khi đối tác upload ảnh, file ảnh vật lý được ghi thẳng vào ổ đĩa của server backend Render, đồng thời lưu đường dẫn tương đối (ví dụ: `/uploads/services/img.png`) vào cột image_url trong cơ sở dữ liệu PostgreSQL (chứ không lưu trực tiếp file ảnh vào cơ sở dữ liệu Supabase hay code GitHub). Phía Frontend Angular sẽ gọi đường dẫn tương đối này qua Express static middleware để hiển thị hình ảnh. Giải pháp này hoàn toàn miễn phí và dễ lập trình, rất phù hợp cho giai đoạn chạy thử nghiệm của đồ án. Tuy nhiên, vì Render free tier sẽ xóa sạch các file lưu cục bộ mỗi khi khởi động lại máy chủ (ephemeral storage), nhóm xác định đây là giải pháp tạm thời trước khi nâng cấp lên các kho lưu trữ chuyên dụng như Cloudinary hoặc AWS S3 trong tương lai.</w:t>
       </w:r>
     </w:p>
     <w:p>
@@ -904,7 +1016,7 @@
           <w:color w:val="000000"/>
           <w:sz w:val="26"/>
         </w:rPr>
-        <w:t>Trong quá trình làm việc nhóm, thay vì gửi mã nguồn thủ công qua tin nhắn hoặc nén tệp tin (dễ gây lỗi đè code của nhau, mất lịch sử sửa đổi và tốn thời gian đồng bộ các tệp tin cấu hình), chúng tôi quyết định sử dụng Git và GitHub để quản lý phiên bản. Git cho phép mỗi thành viên phát triển các tính năng độc lập trên các nhánh con (branches), sau đó hợp nhất mã nguồn thông qua cơ chế Pull Request trên GitHub. Quy trình này giúp tự động kiểm tra xung đột dòng code (conflict resolution) trước khi gộp vào nhánh chính main, đảm bảo mã nguồn luôn hoạt động ổn định và có thể trực tiếp triển khai lên môi trường web.</w:t>
+        <w:t>Nhóm phát triển sử dụng Git và GitHub để quản lý mã nguồn vì các thành viên có thể làm việc song song, lập trình các nhánh độc lập mà không lo bị đè đắp code của nhau, đồng thời lưu giữ lại toàn bộ lịch sử chỉnh sửa để dễ dàng quay lui khi có lỗi phát sinh.</w:t>
       </w:r>
     </w:p>
     <w:p>
@@ -935,7 +1047,7 @@
           <w:color w:val="000000"/>
           <w:sz w:val="26"/>
         </w:rPr>
-        <w:t>Chúng tôi sử dụng Figma để thiết kế bản vẽ mẫu giao diện cho các màn hình khách du lịch và trang đối tác. Figma hỗ trợ đắc lực nhiều tác vụ thiết kế từ vẽ khung xương wireframe cho tới mockup chi tiết và prototype tương tác. Nền tảng này cho phép nhiều thành viên trong nhóm cùng thiết kế và chỉnh sửa đồng thời trong thời gian thực, đồng thời tự động xuất mã nguồn CSS từ bản thiết kế giao diện, cực kỳ phù hợp với tiến độ làm việc nhóm và chính sách hỗ trợ tài khoản giáo dục miễn phí cho sinh viên.</w:t>
+        <w:t>Nhóm phát triển sử dụng Figma vì công cụ này hỗ trợ thiết kế giao diện trực quan và cho phép các thành viên trong nhóm cùng chỉnh sửa các bản vẽ mẫu (mockup) trong thời gian thực, giúp đồng bộ nhanh ý tưởng thiết kế giao diện các màn hình của GreenSteps trước khi tiến hành viết mã nguồn Angular.</w:t>
       </w:r>
     </w:p>
     <w:p>
@@ -966,7 +1078,7 @@
           <w:color w:val="000000"/>
           <w:sz w:val="26"/>
         </w:rPr>
-        <w:t>Nhóm phát triển sử dụng Postman để kiểm thử độc lập hiệu năng và định dạng dữ liệu trả về của các API Backend trước khi tích hợp vào giao diện Angular, giúp cô lập lỗi và đảm bảo tính chính xác của dữ liệu truyền thông giữa client và server.</w:t>
+        <w:t>Nhóm sử dụng Postman vì đây là công cụ hỗ trợ kiểm thử giao tiếp API. Trong quá trình phát triển Backend, nhóm dùng Postman để gửi các yêu cầu giả lập (như gửi mã OTP, đăng nhập tài khoản, thực hiện đặt cọc ví tiền) để kiểm tra xem phản hồi JSON của máy chủ Express đã đúng định dạng dữ liệu và nghiệp vụ chưa, giúp sửa các lỗi dữ liệu ở Backend từ sớm trước khi tích hợp vào giao diện Angular của Frontend.</w:t>
       </w:r>
     </w:p>
     <w:p>
@@ -997,7 +1109,38 @@
           <w:color w:val="000000"/>
           <w:sz w:val="26"/>
         </w:rPr>
-        <w:t>Nhóm phát triển sử dụng Lucidchart để vẽ sơ đồ thực thể mối quan hệ ERD và sơ đồ luồng dữ liệu DFD. Chúng tôi lựa chọn Lucidchart thay vì Draw.io nhờ khả năng hỗ trợ đa dạng các mẫu hình khối chuyên dụng cho sơ đồ nghiệp vụ và lược đồ cơ sở dữ liệu quan hệ, cho phép nhiều người dùng đồng thời chỉnh sửa trực quan trong thời gian thực, và hỗ trợ xuất trực tiếp script SQL tạo bảng từ ERD. Điều này khắc phục hạn chế lớn của Draw.io vốn có tính năng cộng tác nhóm kém linh hoạt và thiếu các hình khối chuyên dụng cho sơ đồ cấu trúc dữ liệu phức tạp.</w:t>
+        <w:t>Nhóm phát triển sử dụng Lucidchart vì công cụ này cung cấp nhiều ký hiệu sơ đồ chuẩn hóa và cho phép nhóm cùng tham gia thiết kế sơ đồ thực thể mối quan hệ ERD và sơ đồ luồng dữ liệu DFD một cách trực quan qua giao diện web.</w:t>
+      </w:r>
+    </w:p>
+    <w:p>
+      <w:pPr>
+        <w:spacing w:line="360" w:lineRule="auto" w:before="240" w:after="80"/>
+      </w:pPr>
+      <w:r>
+        <w:rPr>
+          <w:rFonts w:ascii="Times New Roman" w:hAnsi="Times New Roman"/>
+          <w:b/>
+          <w:i w:val="0"/>
+          <w:color w:val="000000"/>
+          <w:sz w:val="26"/>
+        </w:rPr>
+        <w:t>2.5.5. Docker và Docker Compose</w:t>
+      </w:r>
+    </w:p>
+    <w:p>
+      <w:pPr>
+        <w:spacing w:line="360" w:lineRule="auto" w:before="0" w:after="120"/>
+        <w:jc w:val="both"/>
+      </w:pPr>
+      <w:r>
+        <w:rPr>
+          <w:rFonts w:ascii="Times New Roman" w:hAnsi="Times New Roman"/>
+          <w:b w:val="0"/>
+          <w:i w:val="0"/>
+          <w:color w:val="000000"/>
+          <w:sz w:val="26"/>
+        </w:rPr>
+        <w:t>Nhóm phát triển tích hợp công cụ Docker và Docker Compose vì công cụ này giúp các thành viên khởi tạo nhanh chóng một container cơ sở dữ liệu PostgreSQL cục bộ chạy đồng nhất trên máy tính cá nhân của mỗi thành viên chỉ bằng một dòng lệnh. Việc này giúp nhóm tránh được sự phức tạp khi phải tự cài đặt PostgreSQL thủ công trên hệ điều hành khác nhau, tránh xung đột cổng kết nối và đảm bảo cấu hình cơ sở dữ liệu chạy thử nghiệm ở máy của tất cả thành viên là giống hệt nhau.</w:t>
       </w:r>
     </w:p>
     <w:sectPr>

</xml_diff>

<commit_message>
doc: finalize Chuong 2 Word document with active database voice, SVN/Figma/Postman/Lucidchart comparisons, and Docker section removal
</commit_message>
<xml_diff>
--- a/Chuong_2_Cong_Nghe_Su_Dung_Final.docx
+++ b/Chuong_2_Cong_Nghe_Su_Dung_Final.docx
@@ -2,186 +2,6 @@
 <file path=word/document.xml><?xml version="1.0" encoding="utf-8"?>
 <w:document xmlns:wpc="http://schemas.microsoft.com/office/word/2010/wordprocessingCanvas" xmlns:mo="http://schemas.microsoft.com/office/mac/office/2008/main" xmlns:mc="http://schemas.openxmlformats.org/markup-compatibility/2006" xmlns:mv="urn:schemas-microsoft-com:mac:vml" xmlns:o="urn:schemas-microsoft-com:office:office" xmlns:r="http://schemas.openxmlformats.org/officeDocument/2006/relationships" xmlns:m="http://schemas.openxmlformats.org/officeDocument/2006/math" xmlns:v="urn:schemas-microsoft-com:vml" xmlns:wp14="http://schemas.microsoft.com/office/word/2010/wordprocessingDrawing" xmlns:wp="http://schemas.openxmlformats.org/drawingml/2006/wordprocessingDrawing" xmlns:w10="urn:schemas-microsoft-com:office:word" xmlns:w="http://schemas.openxmlformats.org/wordprocessingml/2006/main" xmlns:w14="http://schemas.microsoft.com/office/word/2010/wordml" xmlns:wpg="http://schemas.microsoft.com/office/word/2010/wordprocessingGroup" xmlns:wpi="http://schemas.microsoft.com/office/word/2010/wordprocessingInk" xmlns:wne="http://schemas.microsoft.com/office/word/2006/wordml" xmlns:wps="http://schemas.microsoft.com/office/word/2010/wordprocessingShape" mc:Ignorable="w14 wp14">
   <w:body>
-    <w:p>
-      <w:pPr>
-        <w:spacing w:line="360" w:lineRule="auto" w:before="0" w:after="120"/>
-        <w:jc w:val="both"/>
-      </w:pPr>
-      <w:r>
-        <w:rPr>
-          <w:rFonts w:ascii="Times New Roman" w:hAnsi="Times New Roman"/>
-          <w:b w:val="0"/>
-          <w:i w:val="0"/>
-          <w:color w:val="000000"/>
-          <w:sz w:val="26"/>
-        </w:rPr>
-        <w:t xml:space="preserve">1. </w:t>
-      </w:r>
-      <w:r>
-        <w:rPr>
-          <w:rFonts w:ascii="Times New Roman" w:hAnsi="Times New Roman"/>
-          <w:b w:val="0"/>
-          <w:i w:val="0"/>
-          <w:color w:val="000000"/>
-          <w:sz w:val="26"/>
-        </w:rPr>
-        <w:t>Lớp giao diện (Frontend) chứa Vercel:</w:t>
-      </w:r>
-      <w:r>
-        <w:rPr>
-          <w:rFonts w:ascii="Times New Roman" w:hAnsi="Times New Roman"/>
-          <w:b w:val="0"/>
-          <w:i w:val="0"/>
-          <w:color w:val="000000"/>
-          <w:sz w:val="26"/>
-        </w:rPr>
-        <w:t xml:space="preserve"> Vercel nằm ở mục 2.1.5 ngay trong Frontend.</w:t>
-      </w:r>
-    </w:p>
-    <w:p>
-      <w:pPr>
-        <w:spacing w:line="360" w:lineRule="auto" w:before="0" w:after="120"/>
-        <w:jc w:val="both"/>
-      </w:pPr>
-      <w:r>
-        <w:rPr>
-          <w:rFonts w:ascii="Times New Roman" w:hAnsi="Times New Roman"/>
-          <w:b w:val="0"/>
-          <w:i w:val="0"/>
-          <w:color w:val="000000"/>
-          <w:sz w:val="26"/>
-        </w:rPr>
-        <w:t xml:space="preserve">2. </w:t>
-      </w:r>
-      <w:r>
-        <w:rPr>
-          <w:rFonts w:ascii="Times New Roman" w:hAnsi="Times New Roman"/>
-          <w:b w:val="0"/>
-          <w:i w:val="0"/>
-          <w:color w:val="000000"/>
-          <w:sz w:val="26"/>
-        </w:rPr>
-        <w:t>Không có Gemini AI:</w:t>
-      </w:r>
-      <w:r>
-        <w:rPr>
-          <w:rFonts w:ascii="Times New Roman" w:hAnsi="Times New Roman"/>
-          <w:b w:val="0"/>
-          <w:i w:val="0"/>
-          <w:color w:val="000000"/>
-          <w:sz w:val="26"/>
-        </w:rPr>
-        <w:t xml:space="preserve"> Giữ cấu trúc 5 lớp chính không nhắc tới Gemini AI.</w:t>
-      </w:r>
-    </w:p>
-    <w:p>
-      <w:pPr>
-        <w:spacing w:line="360" w:lineRule="auto" w:before="0" w:after="120"/>
-        <w:jc w:val="both"/>
-      </w:pPr>
-      <w:r>
-        <w:rPr>
-          <w:rFonts w:ascii="Times New Roman" w:hAnsi="Times New Roman"/>
-          <w:b w:val="0"/>
-          <w:i w:val="0"/>
-          <w:color w:val="000000"/>
-          <w:sz w:val="26"/>
-        </w:rPr>
-        <w:t xml:space="preserve">3. </w:t>
-      </w:r>
-      <w:r>
-        <w:rPr>
-          <w:rFonts w:ascii="Times New Roman" w:hAnsi="Times New Roman"/>
-          <w:b w:val="0"/>
-          <w:i w:val="0"/>
-          <w:color w:val="000000"/>
-          <w:sz w:val="26"/>
-        </w:rPr>
-        <w:t>So sánh PostgreSQL &amp; MongoDB:</w:t>
-      </w:r>
-      <w:r>
-        <w:rPr>
-          <w:rFonts w:ascii="Times New Roman" w:hAnsi="Times New Roman"/>
-          <w:b w:val="0"/>
-          <w:i w:val="0"/>
-          <w:color w:val="000000"/>
-          <w:sz w:val="26"/>
-        </w:rPr>
-        <w:t xml:space="preserve"> Làm nổi bật ưu điểm của cả hai và cơ chế khóa dòng `SELECT FOR UPDATE` thực tế chống race condition ví tiền.</w:t>
-      </w:r>
-    </w:p>
-    <w:p>
-      <w:pPr>
-        <w:spacing w:line="360" w:lineRule="auto" w:before="0" w:after="120"/>
-        <w:jc w:val="both"/>
-      </w:pPr>
-      <w:r>
-        <w:rPr>
-          <w:rFonts w:ascii="Times New Roman" w:hAnsi="Times New Roman"/>
-          <w:b w:val="0"/>
-          <w:i w:val="0"/>
-          <w:color w:val="000000"/>
-          <w:sz w:val="26"/>
-        </w:rPr>
-        <w:t xml:space="preserve">4. </w:t>
-      </w:r>
-      <w:r>
-        <w:rPr>
-          <w:rFonts w:ascii="Times New Roman" w:hAnsi="Times New Roman"/>
-          <w:b w:val="0"/>
-          <w:i w:val="0"/>
-          <w:color w:val="000000"/>
-          <w:sz w:val="26"/>
-        </w:rPr>
-        <w:t>Lưu trữ ảnh cục bộ:</w:t>
-      </w:r>
-      <w:r>
-        <w:rPr>
-          <w:rFonts w:ascii="Times New Roman" w:hAnsi="Times New Roman"/>
-          <w:b w:val="0"/>
-          <w:i w:val="0"/>
-          <w:color w:val="000000"/>
-          <w:sz w:val="26"/>
-        </w:rPr>
-        <w:t xml:space="preserve"> Nêu rõ ảnh được lưu trên ổ đĩa của Render backend và là giải pháp tạm thời do ổ đĩa của Render Free tier có tính tạm thời (ephemeral storage).</w:t>
-      </w:r>
-    </w:p>
-    <w:p>
-      <w:pPr>
-        <w:spacing w:line="360" w:lineRule="auto" w:before="0" w:after="120"/>
-        <w:jc w:val="both"/>
-      </w:pPr>
-      <w:r>
-        <w:rPr>
-          <w:rFonts w:ascii="Times New Roman" w:hAnsi="Times New Roman"/>
-          <w:b w:val="0"/>
-          <w:i w:val="0"/>
-          <w:color w:val="000000"/>
-          <w:sz w:val="26"/>
-        </w:rPr>
-        <w:t xml:space="preserve">5. </w:t>
-      </w:r>
-      <w:r>
-        <w:rPr>
-          <w:rFonts w:ascii="Times New Roman" w:hAnsi="Times New Roman"/>
-          <w:b w:val="0"/>
-          <w:i w:val="0"/>
-          <w:color w:val="000000"/>
-          <w:sz w:val="26"/>
-        </w:rPr>
-        <w:t>Git, Figma, Postman, Docker:</w:t>
-      </w:r>
-      <w:r>
-        <w:rPr>
-          <w:rFonts w:ascii="Times New Roman" w:hAnsi="Times New Roman"/>
-          <w:b w:val="0"/>
-          <w:i w:val="0"/>
-          <w:color w:val="000000"/>
-          <w:sz w:val="26"/>
-        </w:rPr>
-        <w:t xml:space="preserve"> Chỉnh sửa văn phong chủ động, giải nghĩa Docker và Postman trong dự án.</w:t>
-      </w:r>
-    </w:p>
     <w:p>
       <w:pPr>
         <w:spacing w:line="360" w:lineRule="auto" w:before="240" w:after="360"/>
@@ -211,7 +31,178 @@
           <w:color w:val="000000"/>
           <w:sz w:val="26"/>
         </w:rPr>
-        <w:t>Sau quá trình học tập, tìm kiếm tài liệu và tham khảo cấu trúc các trang web thực tế, nhóm quyết định lựa chọn "Mô hình Kiến trúc Web 3 Lớp kết hợp Dịch vụ RESTful và Cơ sở Dữ liệu Lai" làm nền tảng định hướng thiết kế hệ thống. Nhóm lựa chọn kiến trúc này vì nó giúp tách biệt rõ ràng 3 phần độc lập: lớp giao diện người dùng (Presentation Layer), lớp logic nghiệp vụ (Application Layer) và lớp cơ sở dữ liệu (Data Layer). Sự phân rã này mang lại tính liền mạch cho dự án, giúp các thành viên có thể phát triển giao diện độc lập mà không ảnh hưởng tới dữ liệu ở backend, đồng thời giúp việc tìm kiếm lỗi và bảo trì các chức năng (như ví điện tử hay lên lịch trình) diễn ra dễ dàng hơn rất nhiều.</w:t>
+        <w:t xml:space="preserve">Sau quá trình học tập, tìm kiếm tài liệu và tham khảo cấu trúc các trang web thực tế, nhóm phát triển xác định được một khung cơ sở lý thuyết về cấu trúc web tiêu chuẩn là </w:t>
+      </w:r>
+      <w:r>
+        <w:rPr>
+          <w:rFonts w:ascii="Times New Roman" w:hAnsi="Times New Roman"/>
+          <w:b w:val="0"/>
+          <w:i w:val="0"/>
+          <w:color w:val="000000"/>
+          <w:sz w:val="26"/>
+        </w:rPr>
+        <w:t>Kiến trúc Web 3 lớp truyền thống</w:t>
+      </w:r>
+      <w:r>
+        <w:rPr>
+          <w:rFonts w:ascii="Times New Roman" w:hAnsi="Times New Roman"/>
+          <w:b w:val="0"/>
+          <w:i w:val="0"/>
+          <w:color w:val="000000"/>
+          <w:sz w:val="26"/>
+        </w:rPr>
+        <w:t xml:space="preserve"> (3-Tier Architecture). Khung lý thuyết này phân chia hệ thống thành 3 thành phần chính độc lập:</w:t>
+      </w:r>
+    </w:p>
+    <w:p>
+      <w:pPr>
+        <w:spacing w:line="360" w:lineRule="auto" w:before="0" w:after="120"/>
+        <w:ind w:left="360"/>
+        <w:jc w:val="both"/>
+      </w:pPr>
+      <w:r>
+        <w:rPr>
+          <w:rFonts w:ascii="Times New Roman" w:hAnsi="Times New Roman"/>
+          <w:b w:val="0"/>
+          <w:i w:val="0"/>
+          <w:color w:val="000000"/>
+          <w:sz w:val="26"/>
+        </w:rPr>
+        <w:t>Lớp trình diễn (Presentation Layer):</w:t>
+      </w:r>
+      <w:r>
+        <w:rPr>
+          <w:rFonts w:ascii="Times New Roman" w:hAnsi="Times New Roman"/>
+          <w:b w:val="0"/>
+          <w:i w:val="0"/>
+          <w:color w:val="000000"/>
+          <w:sz w:val="26"/>
+        </w:rPr>
+        <w:t xml:space="preserve"> Đảm nhiệm việc hiển thị giao diện và nhận tương tác từ người dùng.</w:t>
+      </w:r>
+    </w:p>
+    <w:p>
+      <w:pPr>
+        <w:spacing w:line="360" w:lineRule="auto" w:before="0" w:after="120"/>
+        <w:ind w:left="360"/>
+        <w:jc w:val="both"/>
+      </w:pPr>
+      <w:r>
+        <w:rPr>
+          <w:rFonts w:ascii="Times New Roman" w:hAnsi="Times New Roman"/>
+          <w:b w:val="0"/>
+          <w:i w:val="0"/>
+          <w:color w:val="000000"/>
+          <w:sz w:val="26"/>
+        </w:rPr>
+        <w:t>Lớp logic nghiệp vụ (Application Layer):</w:t>
+      </w:r>
+      <w:r>
+        <w:rPr>
+          <w:rFonts w:ascii="Times New Roman" w:hAnsi="Times New Roman"/>
+          <w:b w:val="0"/>
+          <w:i w:val="0"/>
+          <w:color w:val="000000"/>
+          <w:sz w:val="26"/>
+        </w:rPr>
+        <w:t xml:space="preserve"> Xử lý các quy tắc nghiệp vụ và tính toán logic của hệ thống.</w:t>
+      </w:r>
+    </w:p>
+    <w:p>
+      <w:pPr>
+        <w:spacing w:line="360" w:lineRule="auto" w:before="0" w:after="120"/>
+        <w:ind w:left="360"/>
+        <w:jc w:val="both"/>
+      </w:pPr>
+      <w:r>
+        <w:rPr>
+          <w:rFonts w:ascii="Times New Roman" w:hAnsi="Times New Roman"/>
+          <w:b w:val="0"/>
+          <w:i w:val="0"/>
+          <w:color w:val="000000"/>
+          <w:sz w:val="26"/>
+        </w:rPr>
+        <w:t>Lớp dữ liệu (Data Layer):</w:t>
+      </w:r>
+      <w:r>
+        <w:rPr>
+          <w:rFonts w:ascii="Times New Roman" w:hAnsi="Times New Roman"/>
+          <w:b w:val="0"/>
+          <w:i w:val="0"/>
+          <w:color w:val="000000"/>
+          <w:sz w:val="26"/>
+        </w:rPr>
+        <w:t xml:space="preserve"> Quản lý việc lưu trữ, truy xuất và duy trì tính toàn vẹn của cơ sở dữ liệu.</w:t>
+      </w:r>
+    </w:p>
+    <w:p>
+      <w:pPr>
+        <w:spacing w:line="360" w:lineRule="auto" w:before="0" w:after="120"/>
+        <w:jc w:val="both"/>
+      </w:pPr>
+      <w:r>
+        <w:rPr>
+          <w:rFonts w:ascii="Times New Roman" w:hAnsi="Times New Roman"/>
+          <w:b w:val="0"/>
+          <w:i w:val="0"/>
+          <w:color w:val="000000"/>
+          <w:sz w:val="26"/>
+        </w:rPr>
+        <w:t xml:space="preserve">Nhận thấy mô hình truyền thống này là nền tảng vững chắc để phát triển các ứng dụng web ổn định, nhóm quyết định lựa chọn và cải tiến mô hình này thành </w:t>
+      </w:r>
+      <w:r>
+        <w:rPr>
+          <w:rFonts w:ascii="Times New Roman" w:hAnsi="Times New Roman"/>
+          <w:b w:val="0"/>
+          <w:i w:val="0"/>
+          <w:color w:val="000000"/>
+          <w:sz w:val="26"/>
+        </w:rPr>
+        <w:t>"Mô hình Kiến trúc Web 3 Lớp kết hợp Dịch vụ RESTful và Cơ sở Dữ liệu Lai"</w:t>
+      </w:r>
+      <w:r>
+        <w:rPr>
+          <w:rFonts w:ascii="Times New Roman" w:hAnsi="Times New Roman"/>
+          <w:b w:val="0"/>
+          <w:i w:val="0"/>
+          <w:color w:val="000000"/>
+          <w:sz w:val="26"/>
+        </w:rPr>
+        <w:t xml:space="preserve"> (3-Tier Web Architecture with RESTful Services and Hybrid Relational-Document Database Framework). Sự điều chỉnh này nhằm mục tiêu tối ưu hóa trải nghiệm người dùng, phù hợp với phạm vi phát triển sản phẩm du lịch sinh thái và khả năng kỹ thuật thực tế của nhóm:</w:t>
+      </w:r>
+    </w:p>
+    <w:p>
+      <w:pPr>
+        <w:spacing w:line="360" w:lineRule="auto" w:before="0" w:after="120"/>
+        <w:ind w:left="360"/>
+        <w:jc w:val="both"/>
+      </w:pPr>
+      <w:r>
+        <w:rPr>
+          <w:rFonts w:ascii="Times New Roman" w:hAnsi="Times New Roman"/>
+          <w:b w:val="0"/>
+          <w:i w:val="0"/>
+          <w:color w:val="000000"/>
+          <w:sz w:val="26"/>
+        </w:rPr>
+        <w:t>Bằng việc tích hợp các dịch vụ RESTful API phi trạng thái ở giữa, Frontend và Backend có thể giao tiếp mượt mà qua các gói tin JSON, giúp giảm tải xử lý và tăng tốc độ tải trang SPA.</w:t>
+      </w:r>
+    </w:p>
+    <w:p>
+      <w:pPr>
+        <w:spacing w:line="360" w:lineRule="auto" w:before="0" w:after="120"/>
+        <w:ind w:left="360"/>
+        <w:jc w:val="both"/>
+      </w:pPr>
+      <w:r>
+        <w:rPr>
+          <w:rFonts w:ascii="Times New Roman" w:hAnsi="Times New Roman"/>
+          <w:b w:val="0"/>
+          <w:i w:val="0"/>
+          <w:color w:val="000000"/>
+          <w:sz w:val="26"/>
+        </w:rPr>
+        <w:t>Bằng việc tích hợp tính năng JSONB của PostgreSQL để làm cơ sở dữ liệu lai, nhóm có thể lưu trữ các cấu trúc dữ liệu lịch trình phức tạp và thay đổi linh hoạt ngay trong cơ sở dữ liệu quan hệ mà không cần phải thiết kế quá nhiều bảng phụ phức tạp.</w:t>
       </w:r>
     </w:p>
     <w:p>
@@ -710,23 +701,7 @@
           <w:color w:val="000000"/>
           <w:sz w:val="26"/>
         </w:rPr>
-        <w:t>Nhóm phát triển sử dụng hệ quản trị cơ sở dữ liệu quan hệ PostgreSQL làm kho lưu trữ trung tâm của hệ thống. Chúng tôi kết hợp sử dụng kiểu dữ liệu JSONB được PostgreSQL hỗ trợ để lưu trữ các mảng lịch trình hoạt động động hàng ngày và thông tin dịch vụ xanh dưới dạng dữ liệu bán cấu trúc (JSON nhị phân), lưu trực tiếp lồng nhau trong một dòng của bảng mà không cần tách ra nhiều bảng phụ.</w:t>
-      </w:r>
-    </w:p>
-    <w:p>
-      <w:pPr>
-        <w:spacing w:line="360" w:lineRule="auto" w:before="0" w:after="120"/>
-        <w:jc w:val="both"/>
-      </w:pPr>
-      <w:r>
-        <w:rPr>
-          <w:rFonts w:ascii="Times New Roman" w:hAnsi="Times New Roman"/>
-          <w:b w:val="0"/>
-          <w:i w:val="0"/>
-          <w:color w:val="000000"/>
-          <w:sz w:val="26"/>
-        </w:rPr>
-        <w:t>Chúng tôi bắt buộc phải lựa chọn PostgreSQL thay vì MongoDB vì đặc thù của GreenSteps là hệ thống xử lý các giao dịch ví điện tử (E-wallet) và đặt phòng nghỉ, chuyến đi (Booking) nhạy cảm, đòi hỏi độ tin cậy và toàn vẹn dữ liệu ở mức tối đa:</w:t>
+        <w:t>Nhóm chủ động lựa chọn hệ quản trị cơ sở dữ liệu quan hệ PostgreSQL làm kho lưu trữ trung tâm của GreenSteps để đảm bảo an toàn tối đa cho dòng tiền và dữ liệu đặt chỗ nhạy cảm của người dùng. Trong quá trình thiết kế, nhóm đã phân tích kỹ lưỡng ưu, nhược điểm của hai giải pháp dữ liệu phổ biến hiện nay là PostgreSQL và MongoDB:</w:t>
       </w:r>
     </w:p>
     <w:p>
@@ -743,7 +718,7 @@
           <w:color w:val="000000"/>
           <w:sz w:val="26"/>
         </w:rPr>
-        <w:t>Tính nhất quán ACID và ràng buộc cứng ở nhân cơ sở dữ liệu:</w:t>
+        <w:t>Ưu điểm của MongoDB (NoSQL):</w:t>
       </w:r>
       <w:r>
         <w:rPr>
@@ -753,7 +728,7 @@
           <w:color w:val="000000"/>
           <w:sz w:val="26"/>
         </w:rPr>
-        <w:t xml:space="preserve"> PostgreSQL hỗ trợ kiểm soát dữ liệu thông qua các ràng buộc khóa ngoại (Foreign Keys) và kiểm tra miền trị cứng (như ràng buộc số dư ví `balance &gt;= 0`) ngay trong nhân của cơ sở dữ liệu. MongoDB (NoSQL) hoạt động dựa trên mô hình tài liệu tự do, thiếu các cơ chế kiểm soát ràng buộc cứng ở nhân DB, dẫn đến rủi ro rò rỉ dữ liệu hoặc cập nhật thiếu đồng bộ giữa ví tiền và đơn hàng khi có lỗi mạng.</w:t>
+        <w:t xml:space="preserve"> MongoDB hoạt động theo mô hình hướng tài liệu (document-oriented), cho phép lưu trữ dữ liệu dưới dạng JSON linh hoạt mà không cần khai báo schema cứng nhắc trước. Mô hình này rất phù hợp cho các hệ thống lớn đòi hỏi tốc độ đọc ghi cực nhanh và khả năng mở rộng quy mô dữ liệu theo chiều ngang một cách dễ dàng. Tuy nhiên, MongoDB lại gặp nhược điểm lớn trong việc đảm bảo tính toàn vẹn dữ liệu quan hệ và thiếu đi các ràng buộc ràng buộc chặt chẽ từ nhân cơ sở dữ liệu.</w:t>
       </w:r>
     </w:p>
     <w:p>
@@ -770,7 +745,7 @@
           <w:color w:val="000000"/>
           <w:sz w:val="26"/>
         </w:rPr>
-        <w:t>Cơ chế khóa dòng chống tranh chấp đồng thời (Race Conditions):</w:t>
+        <w:t>Quyết định sử dụng PostgreSQL (SQL):</w:t>
       </w:r>
       <w:r>
         <w:rPr>
@@ -780,7 +755,7 @@
           <w:color w:val="000000"/>
           <w:sz w:val="26"/>
         </w:rPr>
-        <w:t xml:space="preserve"> Khi hai khách hàng cùng bấm đặt một phòng cuối cùng của một chuyến đi vào cùng một thời điểm, PostgreSQL hỗ trợ cơ chế khóa dòng (`SELECT FOR UPDATE`) trong một giao dịch an toàn. Server sẽ khóa bản ghi phòng đó lại, xử lý lần lượt từng người mua để ngăn chặn lỗi bán lặp (Double-selling). MongoDB không hỗ trợ cơ chế khóa dòng này một cách tự nhiên, rất dễ xảy ra hiện tượng tranh chấp ghi dữ liệu làm thất thoát số dư ví hoặc đặt quá số lượng phòng cho phép.</w:t>
+        <w:t xml:space="preserve"> Đối với dự án GreenSteps chứa phân hệ ví tiền (E-wallet) và đặt phòng nghỉ, chuyến đi (booking) nhạy cảm đòi hỏi sự chính xác tuyệt đối, nhóm nhận thấy PostgreSQL là lựa chọn tối ưu nhất nhờ:</w:t>
       </w:r>
     </w:p>
     <w:p>
@@ -797,7 +772,7 @@
           <w:color w:val="000000"/>
           <w:sz w:val="26"/>
         </w:rPr>
-        <w:t>Tính năng dữ liệu lai JSONB:</w:t>
+        <w:t>Tính nhất quán giao dịch ACID và ràng buộc cứng ở nhân cơ sở dữ liệu:</w:t>
       </w:r>
       <w:r>
         <w:rPr>
@@ -807,7 +782,61 @@
           <w:color w:val="000000"/>
           <w:sz w:val="26"/>
         </w:rPr>
-        <w:t xml:space="preserve"> Trong khi đảm bảo an toàn ví tiền bằng các bảng quan hệ nghiêm ngặt, chúng tôi vẫn lưu trữ lịch trình chuyến đi biến đổi linh hoạt trong cùng một dòng bảng bằng cột JSONB. Điều này mang lại sự linh hoạt tương tự như MongoDB mà không phải hy sinh độ an toàn giao dịch tài chính của PostgreSQL.</w:t>
+        <w:t xml:space="preserve"> PostgreSQL hỗ trợ kiểm soát dữ liệu thông qua các ràng buộc khóa ngoại (Foreign Keys) và kiểm tra miền trị cứng (như ràng buộc số dư ví `balance &gt;= 0`) ngay trong nhân của cơ sở dữ liệu. Điều này ngăn ngừa rủi ro rò rỉ dữ liệu hoặc cập nhật thiếu đồng bộ giữa ví tiền và đơn hàng khi có lỗi mạng.</w:t>
+      </w:r>
+    </w:p>
+    <w:p>
+      <w:pPr>
+        <w:spacing w:line="360" w:lineRule="auto" w:before="0" w:after="120"/>
+        <w:ind w:left="360"/>
+        <w:jc w:val="both"/>
+      </w:pPr>
+      <w:r>
+        <w:rPr>
+          <w:rFonts w:ascii="Times New Roman" w:hAnsi="Times New Roman"/>
+          <w:b w:val="0"/>
+          <w:i w:val="0"/>
+          <w:color w:val="000000"/>
+          <w:sz w:val="26"/>
+        </w:rPr>
+        <w:t>Cơ chế khóa dòng chống tranh chấp đồng thời (SELECT FOR UPDATE):</w:t>
+      </w:r>
+      <w:r>
+        <w:rPr>
+          <w:rFonts w:ascii="Times New Roman" w:hAnsi="Times New Roman"/>
+          <w:b w:val="0"/>
+          <w:i w:val="0"/>
+          <w:color w:val="000000"/>
+          <w:sz w:val="26"/>
+        </w:rPr>
+        <w:t xml:space="preserve"> Khi có nhiều người dùng cùng đặt phòng cuối cùng ở một homestay tại một thời điểm, trong code Backend của tệp wallet.controller.js dòng 144, nhóm sử dụng tính năng khóa dòng dữ liệu (`lock: transaction.LOCK.UPDATE` của Sequelize - tương đương lệnh `SELECT FOR UPDATE` trong SQL). Lệnh này giúp khóa tạm thời bản ghi số dư ví và trạng thái phòng nghỉ trong suốt quá trình trừ tiền và xác nhận giao dịch, giải quyết triệt để lỗi tranh chấp ghi (Race Conditions) gây bán trùng phòng hoặc sai lệch số dư ví.</w:t>
+      </w:r>
+    </w:p>
+    <w:p>
+      <w:pPr>
+        <w:spacing w:line="360" w:lineRule="auto" w:before="0" w:after="120"/>
+        <w:ind w:left="360"/>
+        <w:jc w:val="both"/>
+      </w:pPr>
+      <w:r>
+        <w:rPr>
+          <w:rFonts w:ascii="Times New Roman" w:hAnsi="Times New Roman"/>
+          <w:b w:val="0"/>
+          <w:i w:val="0"/>
+          <w:color w:val="000000"/>
+          <w:sz w:val="26"/>
+        </w:rPr>
+        <w:t>Bù đắp khuyết điểm bằng cột dữ liệu lai JSONB:</w:t>
+      </w:r>
+      <w:r>
+        <w:rPr>
+          <w:rFonts w:ascii="Times New Roman" w:hAnsi="Times New Roman"/>
+          <w:b w:val="0"/>
+          <w:i w:val="0"/>
+          <w:color w:val="000000"/>
+          <w:sz w:val="26"/>
+        </w:rPr>
+        <w:t xml:space="preserve"> Để khắc phục nhược điểm của SQL là cấu trúc bảng cứng nhắc khó lưu trữ mảng lịch trình thay đổi liên tục, nhóm sử dụng kiểu dữ liệu JSONB của PostgreSQL cho cột `current_data` trong bảng dịch vụ. Tính năng này giúp nhóm lưu trữ các mảng hoạt động động của lịch trình lồng nhau trực tiếp trong một dòng của bảng một cách linh hoạt như cấu trúc document của MongoDB, kết hợp hài hòa ưu điểm của cả hai hệ quản trị cơ sở dữ liệu.</w:t>
       </w:r>
     </w:p>
     <w:p>
@@ -838,7 +867,7 @@
           <w:color w:val="000000"/>
           <w:sz w:val="26"/>
         </w:rPr>
-        <w:t>Chúng tôi tương tác với cơ sở dữ liệu thông qua thư viện ánh xạ Sequelize ORM với các tệp model đặt tại thư mục src/models. Khi thực hiện thanh toán đặt cọc lịch trình hoặc đặt chỗ, nhóm áp dụng cơ chế giao dịch của Sequelize là transaction. Phép toán khấu trừ tiền ví của khách và tạo đơn đặt phòng/xe được thực thi đồng thời; nếu có bất kỳ bước nào lỗi, Sequelize tự động phát lệnh Rollback quay lui giao dịch để trả lại tiền ví nguyên vẹn cho khách. Thư viện Sequelize giúp ngăn chặn tấn công SQL Injection và cung cấp cơ chế giao dịch an toàn.</w:t>
+        <w:t>Nhóm chủ động tương tác với cơ sở dữ liệu thông qua thư viện ánh xạ Sequelize ORM với các tệp model đặt tại thư mục src/models. Khi thực hiện thanh toán đặt cọc lịch trình hoặc đặt chỗ, nhóm áp dụng cơ chế giao dịch của Sequelize là transaction. Phép toán khấu trừ tiền ví của khách và tạo đơn đặt phòng/xe được thực thi đồng thời; nếu có bất kỳ bước nào lỗi, Sequelize tự động phát lệnh Rollback quay lui giao dịch để trả lại tiền ví nguyên vẹn cho khách. Thư viện Sequelize giúp ngăn chặn tấn công SQL Injection và cung cấp cơ chế giao dịch an toàn.</w:t>
       </w:r>
     </w:p>
     <w:p>
@@ -869,23 +898,7 @@
           <w:color w:val="000000"/>
           <w:sz w:val="26"/>
         </w:rPr>
-        <w:t>Nhóm phát triển đặt cơ sở dữ liệu PostgreSQL trực tuyến trên đám mây Supabase Cloud trên hạ tầng AWS khu vực ap-southeast-2. Máy chủ API Render kết nối tới Supabase thông qua chuỗi connection string mã hóa bảo mật SSL bắt buộc được định cấu hình trong biến môi trường .env.</w:t>
-      </w:r>
-    </w:p>
-    <w:p>
-      <w:pPr>
-        <w:spacing w:line="360" w:lineRule="auto" w:before="0" w:after="120"/>
-        <w:jc w:val="both"/>
-      </w:pPr>
-      <w:r>
-        <w:rPr>
-          <w:rFonts w:ascii="Times New Roman" w:hAnsi="Times New Roman"/>
-          <w:b w:val="0"/>
-          <w:i w:val="0"/>
-          <w:color w:val="000000"/>
-          <w:sz w:val="26"/>
-        </w:rPr>
-        <w:t>Chúng tôi quyết định chọn Supabase nhằm giải quyết giới hạn không thể kết nối Database cục bộ khi đưa server backend lên Render trực tuyến. Dịch vụ DBaaS của Supabase cung cấp kết nối mã hóa SSL bắt buộc, có giao diện quản lý trực quan và hỗ trợ sao lưu dữ liệu tự động hoàn toàn miễn phí.</w:t>
+        <w:t>Nhóm chủ động cấu hình cơ sở dữ liệu PostgreSQL trực tuyến đặt trên đám mây Supabase Cloud trên hạ tầng AWS khu vực ap-southeast-2 để phục vụ việc lưu trữ trực tuyến 24/7. Máy chủ API Render kết nối tới Supabase thông qua chuỗi connection string mã hóa bảo mật SSL bắt buộc được định cấu hình trong biến môi trường .env. Lựa chọn này giúp giải quyết giới hạn kết nối cơ sở dữ liệu cục bộ khi đưa Backend lên Render trực tuyến, có giao diện quản lý trực quan và hỗ trợ sao lưu dữ liệu tự động hoàn toàn miễn phí.</w:t>
       </w:r>
     </w:p>
     <w:p>
@@ -975,17 +988,18 @@
     </w:p>
     <w:p>
       <w:pPr>
-        <w:spacing w:line="360" w:lineRule="auto" w:before="320" w:after="120"/>
+        <w:spacing w:line="360" w:lineRule="auto" w:before="0" w:after="120"/>
+        <w:jc w:val="both"/>
       </w:pPr>
       <w:r>
         <w:rPr>
           <w:rFonts w:ascii="Times New Roman" w:hAnsi="Times New Roman"/>
-          <w:b/>
+          <w:b w:val="0"/>
           <w:i w:val="0"/>
           <w:color w:val="000000"/>
-          <w:sz w:val="28"/>
+          <w:sz w:val="26"/>
         </w:rPr>
-        <w:t>2.5. Công cụ Hỗ trợ và Phát triển</w:t>
+        <w:t>Nhóm chủ động lựa chọn các công cụ hỗ trợ để tối ưu hóa quy trình cộng tác làm việc nhóm và kiểm thử hệ thống. Dưới đây là phân tích chi tiết lý do lựa chọn của nhóm:</w:t>
       </w:r>
     </w:p>
     <w:p>
@@ -1000,12 +1014,13 @@
           <w:color w:val="000000"/>
           <w:sz w:val="26"/>
         </w:rPr>
-        <w:t>2.5.1. Git &amp; GitHub</w:t>
+        <w:t>2.5.1. Git &amp; GitHub (Quản lý mã nguồn)</w:t>
       </w:r>
     </w:p>
     <w:p>
       <w:pPr>
         <w:spacing w:line="360" w:lineRule="auto" w:before="0" w:after="120"/>
+        <w:ind w:left="360"/>
         <w:jc w:val="both"/>
       </w:pPr>
       <w:r>
@@ -1016,7 +1031,44 @@
           <w:color w:val="000000"/>
           <w:sz w:val="26"/>
         </w:rPr>
-        <w:t>Nhóm phát triển sử dụng Git và GitHub để quản lý mã nguồn vì các thành viên có thể làm việc song song, lập trình các nhánh độc lập mà không lo bị đè đắp code của nhau, đồng thời lưu giữ lại toàn bộ lịch sử chỉnh sửa để dễ dàng quay lui khi có lỗi phát sinh.</w:t>
+        <w:t>Ưu điểm công cụ:</w:t>
+      </w:r>
+      <w:r>
+        <w:rPr>
+          <w:rFonts w:ascii="Times New Roman" w:hAnsi="Times New Roman"/>
+          <w:b w:val="0"/>
+          <w:i w:val="0"/>
+          <w:color w:val="000000"/>
+          <w:sz w:val="26"/>
+        </w:rPr>
+        <w:t xml:space="preserve"> Git là hệ thống quản lý phiên bản phân tán mạnh mẽ, cho phép mỗi thành viên lập trình trên các nhánh độc lập (branches) và gộp code tự động, ghi nhận lịch sử chỉnh sửa rõ ràng.</w:t>
+      </w:r>
+    </w:p>
+    <w:p>
+      <w:pPr>
+        <w:spacing w:line="360" w:lineRule="auto" w:before="0" w:after="120"/>
+        <w:ind w:left="360"/>
+        <w:jc w:val="both"/>
+      </w:pPr>
+      <w:r>
+        <w:rPr>
+          <w:rFonts w:ascii="Times New Roman" w:hAnsi="Times New Roman"/>
+          <w:b w:val="0"/>
+          <w:i w:val="0"/>
+          <w:color w:val="000000"/>
+          <w:sz w:val="26"/>
+        </w:rPr>
+        <w:t>So sánh lựa chọn:</w:t>
+      </w:r>
+      <w:r>
+        <w:rPr>
+          <w:rFonts w:ascii="Times New Roman" w:hAnsi="Times New Roman"/>
+          <w:b w:val="0"/>
+          <w:i w:val="0"/>
+          <w:color w:val="000000"/>
+          <w:sz w:val="26"/>
+        </w:rPr>
+        <w:t xml:space="preserve"> Nhóm lựa chọn Git và dịch vụ lưu trữ GitHub thay vì các phương pháp truyền thống như nén tệp zip gửi qua tin nhắn (vốn rất dễ gây lỗi đè code của nhau, mất lịch sử sửa đổi và tốn thời gian đồng bộ các tệp tin cấu hình). So với SVN (hệ quản lý phiên bản tập trung yêu cầu kết nối server liên tục và khó quản lý nhánh con), Git mang lại khả năng làm việc offline linh hoạt và quy trình xét duyệt code (Pull Request) chuyên nghiệp hơn.</w:t>
       </w:r>
     </w:p>
     <w:p>
@@ -1031,12 +1083,13 @@
           <w:color w:val="000000"/>
           <w:sz w:val="26"/>
         </w:rPr>
-        <w:t>2.5.2. Figma</w:t>
+        <w:t>2.5.2. Figma (Thiết kế UI/UX)</w:t>
       </w:r>
     </w:p>
     <w:p>
       <w:pPr>
         <w:spacing w:line="360" w:lineRule="auto" w:before="0" w:after="120"/>
+        <w:ind w:left="360"/>
         <w:jc w:val="both"/>
       </w:pPr>
       <w:r>
@@ -1047,7 +1100,44 @@
           <w:color w:val="000000"/>
           <w:sz w:val="26"/>
         </w:rPr>
-        <w:t>Nhóm phát triển sử dụng Figma vì công cụ này hỗ trợ thiết kế giao diện trực quan và cho phép các thành viên trong nhóm cùng chỉnh sửa các bản vẽ mẫu (mockup) trong thời gian thực, giúp đồng bộ nhanh ý tưởng thiết kế giao diện các màn hình của GreenSteps trước khi tiến hành viết mã nguồn Angular.</w:t>
+        <w:t>Ưu điểm công cụ:</w:t>
+      </w:r>
+      <w:r>
+        <w:rPr>
+          <w:rFonts w:ascii="Times New Roman" w:hAnsi="Times New Roman"/>
+          <w:b w:val="0"/>
+          <w:i w:val="0"/>
+          <w:color w:val="000000"/>
+          <w:sz w:val="26"/>
+        </w:rPr>
+        <w:t xml:space="preserve"> Figma hỗ trợ vẽ khung xương (wireframe), thiết kế mockup chi tiết và tạo nguyên mẫu tương tác (prototype) nhanh chóng trên trình duyệt.</w:t>
+      </w:r>
+    </w:p>
+    <w:p>
+      <w:pPr>
+        <w:spacing w:line="360" w:lineRule="auto" w:before="0" w:after="120"/>
+        <w:ind w:left="360"/>
+        <w:jc w:val="both"/>
+      </w:pPr>
+      <w:r>
+        <w:rPr>
+          <w:rFonts w:ascii="Times New Roman" w:hAnsi="Times New Roman"/>
+          <w:b w:val="0"/>
+          <w:i w:val="0"/>
+          <w:color w:val="000000"/>
+          <w:sz w:val="26"/>
+        </w:rPr>
+        <w:t>So sánh lựa chọn:</w:t>
+      </w:r>
+      <w:r>
+        <w:rPr>
+          <w:rFonts w:ascii="Times New Roman" w:hAnsi="Times New Roman"/>
+          <w:b w:val="0"/>
+          <w:i w:val="0"/>
+          <w:color w:val="000000"/>
+          <w:sz w:val="26"/>
+        </w:rPr>
+        <w:t xml:space="preserve"> Nhóm chủ động sử dụng Figma thay vì Adobe XD hay Sketch. Figma vượt trội nhờ khả năng cộng tác thời gian thực (nhiều thành viên cùng thiết kế và nhận xét trực tiếp trên một bản vẽ) và hoàn toàn miễn phí cho tài khoản sinh viên. Trong khi đó, Sketch chỉ hỗ trợ hệ điều hành macOS và Adobe XD yêu cầu cài đặt phần mềm nặng, quy trình chia sẻ file phức tạp và giới hạn tính năng ở bản miễn phí.</w:t>
       </w:r>
     </w:p>
     <w:p>
@@ -1062,12 +1152,13 @@
           <w:color w:val="000000"/>
           <w:sz w:val="26"/>
         </w:rPr>
-        <w:t>2.5.3. Postman</w:t>
+        <w:t>2.5.3. Postman (Kiểm thử API)</w:t>
       </w:r>
     </w:p>
     <w:p>
       <w:pPr>
         <w:spacing w:line="360" w:lineRule="auto" w:before="0" w:after="120"/>
+        <w:ind w:left="360"/>
         <w:jc w:val="both"/>
       </w:pPr>
       <w:r>
@@ -1078,7 +1169,44 @@
           <w:color w:val="000000"/>
           <w:sz w:val="26"/>
         </w:rPr>
-        <w:t>Nhóm sử dụng Postman vì đây là công cụ hỗ trợ kiểm thử giao tiếp API. Trong quá trình phát triển Backend, nhóm dùng Postman để gửi các yêu cầu giả lập (như gửi mã OTP, đăng nhập tài khoản, thực hiện đặt cọc ví tiền) để kiểm tra xem phản hồi JSON của máy chủ Express đã đúng định dạng dữ liệu và nghiệp vụ chưa, giúp sửa các lỗi dữ liệu ở Backend từ sớm trước khi tích hợp vào giao diện Angular của Frontend.</w:t>
+        <w:t>Ưu điểm công cụ:</w:t>
+      </w:r>
+      <w:r>
+        <w:rPr>
+          <w:rFonts w:ascii="Times New Roman" w:hAnsi="Times New Roman"/>
+          <w:b w:val="0"/>
+          <w:i w:val="0"/>
+          <w:color w:val="000000"/>
+          <w:sz w:val="26"/>
+        </w:rPr>
+        <w:t xml:space="preserve"> Postman hỗ trợ gửi các request giả lập (GET, POST, PUT, DELETE) với đầy đủ tham số header và payload, đồng thời hiển thị chi tiết kết quả JSON trả về từ server.</w:t>
+      </w:r>
+    </w:p>
+    <w:p>
+      <w:pPr>
+        <w:spacing w:line="360" w:lineRule="auto" w:before="0" w:after="120"/>
+        <w:ind w:left="360"/>
+        <w:jc w:val="both"/>
+      </w:pPr>
+      <w:r>
+        <w:rPr>
+          <w:rFonts w:ascii="Times New Roman" w:hAnsi="Times New Roman"/>
+          <w:b w:val="0"/>
+          <w:i w:val="0"/>
+          <w:color w:val="000000"/>
+          <w:sz w:val="26"/>
+        </w:rPr>
+        <w:t>So sánh lựa chọn:</w:t>
+      </w:r>
+      <w:r>
+        <w:rPr>
+          <w:rFonts w:ascii="Times New Roman" w:hAnsi="Times New Roman"/>
+          <w:b w:val="0"/>
+          <w:i w:val="0"/>
+          <w:color w:val="000000"/>
+          <w:sz w:val="26"/>
+        </w:rPr>
+        <w:t xml:space="preserve"> Nhóm sử dụng Postman để kiểm thử độc lập các API Backend (như gửi mã OTP, đăng nhập tài khoản, thực hiện đặt cọc ví tiền) trước khi tích hợp vào giao diện Angular của Frontend. Postman được lựa chọn thay vì cURL (chạy dòng lệnh terminal khó nhìn) hay Insomnia (quá đơn giản, thiếu các tính năng quản lý môi trường và viết script kiểm thử tự động), giúp nhóm dễ dàng phát hiện lỗi định dạng dữ liệu ở Backend từ sớm, đẩy nhanh tiến độ tích hợp Frontend.</w:t>
       </w:r>
     </w:p>
     <w:p>
@@ -1093,12 +1221,13 @@
           <w:color w:val="000000"/>
           <w:sz w:val="26"/>
         </w:rPr>
-        <w:t>2.5.4. Lucidchart</w:t>
+        <w:t>2.5.4. Lucidchart (Vẽ sơ đồ thiết kế)</w:t>
       </w:r>
     </w:p>
     <w:p>
       <w:pPr>
         <w:spacing w:line="360" w:lineRule="auto" w:before="0" w:after="120"/>
+        <w:ind w:left="360"/>
         <w:jc w:val="both"/>
       </w:pPr>
       <w:r>
@@ -1109,27 +1238,23 @@
           <w:color w:val="000000"/>
           <w:sz w:val="26"/>
         </w:rPr>
-        <w:t>Nhóm phát triển sử dụng Lucidchart vì công cụ này cung cấp nhiều ký hiệu sơ đồ chuẩn hóa và cho phép nhóm cùng tham gia thiết kế sơ đồ thực thể mối quan hệ ERD và sơ đồ luồng dữ liệu DFD một cách trực quan qua giao diện web.</w:t>
+        <w:t>Ưu điểm công cụ:</w:t>
       </w:r>
-    </w:p>
-    <w:p>
-      <w:pPr>
-        <w:spacing w:line="360" w:lineRule="auto" w:before="240" w:after="80"/>
-      </w:pPr>
       <w:r>
         <w:rPr>
           <w:rFonts w:ascii="Times New Roman" w:hAnsi="Times New Roman"/>
-          <w:b/>
+          <w:b w:val="0"/>
           <w:i w:val="0"/>
           <w:color w:val="000000"/>
           <w:sz w:val="26"/>
         </w:rPr>
-        <w:t>2.5.5. Docker và Docker Compose</w:t>
+        <w:t xml:space="preserve"> Lucidchart cung cấp bộ thư viện hình khối chuẩn hóa cho sơ đồ luồng dữ liệu DFD và sơ đồ thực thể mối quan hệ ERD.</w:t>
       </w:r>
     </w:p>
     <w:p>
       <w:pPr>
         <w:spacing w:line="360" w:lineRule="auto" w:before="0" w:after="120"/>
+        <w:ind w:left="360"/>
         <w:jc w:val="both"/>
       </w:pPr>
       <w:r>
@@ -1140,7 +1265,17 @@
           <w:color w:val="000000"/>
           <w:sz w:val="26"/>
         </w:rPr>
-        <w:t>Nhóm phát triển tích hợp công cụ Docker và Docker Compose vì công cụ này giúp các thành viên khởi tạo nhanh chóng một container cơ sở dữ liệu PostgreSQL cục bộ chạy đồng nhất trên máy tính cá nhân của mỗi thành viên chỉ bằng một dòng lệnh. Việc này giúp nhóm tránh được sự phức tạp khi phải tự cài đặt PostgreSQL thủ công trên hệ điều hành khác nhau, tránh xung đột cổng kết nối và đảm bảo cấu hình cơ sở dữ liệu chạy thử nghiệm ở máy của tất cả thành viên là giống hệt nhau.</w:t>
+        <w:t>So sánh lựa chọn:</w:t>
+      </w:r>
+      <w:r>
+        <w:rPr>
+          <w:rFonts w:ascii="Times New Roman" w:hAnsi="Times New Roman"/>
+          <w:b w:val="0"/>
+          <w:i w:val="0"/>
+          <w:color w:val="000000"/>
+          <w:sz w:val="26"/>
+        </w:rPr>
+        <w:t xml:space="preserve"> Nhóm lựa chọn Lucidchart thay vì các công cụ vẽ sơ đồ thông thường như Draw.io hay MS Visio. Lucidchart hỗ trợ xuất trực tiếp mã lệnh SQL tạo bảng từ sơ đồ ERD, giao diện kéo thả mượt mà và hỗ trợ nhóm cùng vẽ trực quan trong thời gian thực. Trái lại, Draw.io có cơ chế đồng tác giả kém linh hoạt dễ bị đè dữ liệu, còn MS Visio là phần mềm trả phí đắt đỏ và chỉ cài đặt được trên hệ điều hành Windows.</w:t>
       </w:r>
     </w:p>
     <w:sectPr>

</xml_diff>

<commit_message>
doc: add AWS Well-Architected Framework to Chapter 2 introduction
</commit_message>
<xml_diff>
--- a/Chuong_2_Cong_Nghe_Su_Dung_Final.docx
+++ b/Chuong_2_Cong_Nghe_Su_Dung_Final.docx
@@ -31,7 +31,7 @@
           <w:color w:val="000000"/>
           <w:sz w:val="26"/>
         </w:rPr>
-        <w:t xml:space="preserve">Sau quá trình học tập, tìm kiếm tài liệu và tham khảo cấu trúc các trang web thực tế, nhóm phát triển xác định được một khung cơ sở lý thuyết về cấu trúc web tiêu chuẩn là </w:t>
+        <w:t xml:space="preserve">Sau quá trình học tập, tìm kiếm tài liệu và tham khảo các tiêu chuẩn thiết kế kiến trúc hệ thống hiện đại trên nền tảng đám mây, nhóm phát triển xác định được khung cơ sở lý thuyết định hướng thiết kế cho GreenSteps là </w:t>
       </w:r>
       <w:r>
         <w:rPr>
@@ -41,7 +41,7 @@
           <w:color w:val="000000"/>
           <w:sz w:val="26"/>
         </w:rPr>
-        <w:t>Kiến trúc Web 3 lớp truyền thống</w:t>
+        <w:t>Khung kiến trúc AWS Well-Architected</w:t>
       </w:r>
       <w:r>
         <w:rPr>
@@ -51,7 +51,7 @@
           <w:color w:val="000000"/>
           <w:sz w:val="26"/>
         </w:rPr>
-        <w:t xml:space="preserve"> (3-Tier Architecture). Khung lý thuyết này phân chia hệ thống thành 3 thành phần chính độc lập:</w:t>
+        <w:t xml:space="preserve"> (AWS Well-Architected Framework). Khung lý thuyết tiêu chuẩn này được Amazon Web Services xây dựng dựa trên 6 trụ cột cốt lõi bao gồm:</w:t>
       </w:r>
     </w:p>
     <w:p>
@@ -68,7 +68,7 @@
           <w:color w:val="000000"/>
           <w:sz w:val="26"/>
         </w:rPr>
-        <w:t>Lớp trình diễn (Presentation Layer):</w:t>
+        <w:t>Vận hành xuất sắc (Operational Excellence):</w:t>
       </w:r>
       <w:r>
         <w:rPr>
@@ -78,7 +78,7 @@
           <w:color w:val="000000"/>
           <w:sz w:val="26"/>
         </w:rPr>
-        <w:t xml:space="preserve"> Đảm nhiệm việc hiển thị giao diện và nhận tương tác từ người dùng.</w:t>
+        <w:t xml:space="preserve"> Tập trung vào việc chạy và giám sát hệ thống để mang lại giá trị kinh doanh, liên tục cải tiến quy trình.</w:t>
       </w:r>
     </w:p>
     <w:p>
@@ -95,7 +95,7 @@
           <w:color w:val="000000"/>
           <w:sz w:val="26"/>
         </w:rPr>
-        <w:t>Lớp logic nghiệp vụ (Application Layer):</w:t>
+        <w:t>Bảo mật (Security):</w:t>
       </w:r>
       <w:r>
         <w:rPr>
@@ -105,7 +105,7 @@
           <w:color w:val="000000"/>
           <w:sz w:val="26"/>
         </w:rPr>
-        <w:t xml:space="preserve"> Xử lý các quy tắc nghiệp vụ và tính toán logic của hệ thống.</w:t>
+        <w:t xml:space="preserve"> Bảo vệ thông tin, dữ liệu và tài sản hệ thống bằng các biện pháp kiểm soát và quản lý đặc quyền.</w:t>
       </w:r>
     </w:p>
     <w:p>
@@ -122,7 +122,7 @@
           <w:color w:val="000000"/>
           <w:sz w:val="26"/>
         </w:rPr>
-        <w:t>Lớp dữ liệu (Data Layer):</w:t>
+        <w:t>Độ tin cậy (Reliability):</w:t>
       </w:r>
       <w:r>
         <w:rPr>
@@ -132,43 +132,7 @@
           <w:color w:val="000000"/>
           <w:sz w:val="26"/>
         </w:rPr>
-        <w:t xml:space="preserve"> Quản lý việc lưu trữ, truy xuất và duy trì tính toàn vẹn của cơ sở dữ liệu.</w:t>
-      </w:r>
-    </w:p>
-    <w:p>
-      <w:pPr>
-        <w:spacing w:line="360" w:lineRule="auto" w:before="0" w:after="120"/>
-        <w:jc w:val="both"/>
-      </w:pPr>
-      <w:r>
-        <w:rPr>
-          <w:rFonts w:ascii="Times New Roman" w:hAnsi="Times New Roman"/>
-          <w:b w:val="0"/>
-          <w:i w:val="0"/>
-          <w:color w:val="000000"/>
-          <w:sz w:val="26"/>
-        </w:rPr>
-        <w:t xml:space="preserve">Nhận thấy mô hình truyền thống này là nền tảng vững chắc để phát triển các ứng dụng web ổn định, nhóm quyết định lựa chọn và cải tiến mô hình này thành </w:t>
-      </w:r>
-      <w:r>
-        <w:rPr>
-          <w:rFonts w:ascii="Times New Roman" w:hAnsi="Times New Roman"/>
-          <w:b w:val="0"/>
-          <w:i w:val="0"/>
-          <w:color w:val="000000"/>
-          <w:sz w:val="26"/>
-        </w:rPr>
-        <w:t>"Mô hình Kiến trúc Web 3 Lớp kết hợp Dịch vụ RESTful và Cơ sở Dữ liệu Lai"</w:t>
-      </w:r>
-      <w:r>
-        <w:rPr>
-          <w:rFonts w:ascii="Times New Roman" w:hAnsi="Times New Roman"/>
-          <w:b w:val="0"/>
-          <w:i w:val="0"/>
-          <w:color w:val="000000"/>
-          <w:sz w:val="26"/>
-        </w:rPr>
-        <w:t xml:space="preserve"> (3-Tier Web Architecture with RESTful Services and Hybrid Relational-Document Database Framework). Sự điều chỉnh này nhằm mục tiêu tối ưu hóa trải nghiệm người dùng, phù hợp với phạm vi phát triển sản phẩm du lịch sinh thái và khả năng kỹ thuật thực tế của nhóm:</w:t>
+        <w:t xml:space="preserve"> Đảm bảo hệ thống có khả năng phục hồi sau các sự cố gián đoạn và tự động đáp ứng nhu cầu tài nguyên.</w:t>
       </w:r>
     </w:p>
     <w:p>
@@ -185,7 +149,17 @@
           <w:color w:val="000000"/>
           <w:sz w:val="26"/>
         </w:rPr>
-        <w:t>Bằng việc tích hợp các dịch vụ RESTful API phi trạng thái ở giữa, Frontend và Backend có thể giao tiếp mượt mà qua các gói tin JSON, giúp giảm tải xử lý và tăng tốc độ tải trang SPA.</w:t>
+        <w:t>Hiệu năng hiệu quả (Performance Efficiency):</w:t>
+      </w:r>
+      <w:r>
+        <w:rPr>
+          <w:rFonts w:ascii="Times New Roman" w:hAnsi="Times New Roman"/>
+          <w:b w:val="0"/>
+          <w:i w:val="0"/>
+          <w:color w:val="000000"/>
+          <w:sz w:val="26"/>
+        </w:rPr>
+        <w:t xml:space="preserve"> Sử dụng tài nguyên tính toán hiệu quả để đáp ứng các yêu cầu hệ thống và duy trì hiệu quả khi công nghệ thay đổi.</w:t>
       </w:r>
     </w:p>
     <w:p>
@@ -202,7 +176,44 @@
           <w:color w:val="000000"/>
           <w:sz w:val="26"/>
         </w:rPr>
-        <w:t>Bằng việc tích hợp tính năng JSONB của PostgreSQL để làm cơ sở dữ liệu lai, nhóm có thể lưu trữ các cấu trúc dữ liệu lịch trình phức tạp và thay đổi linh hoạt ngay trong cơ sở dữ liệu quan hệ mà không cần phải thiết kế quá nhiều bảng phụ phức tạp.</w:t>
+        <w:t>Tối ưu hóa chi phí (Cost Optimization):</w:t>
+      </w:r>
+      <w:r>
+        <w:rPr>
+          <w:rFonts w:ascii="Times New Roman" w:hAnsi="Times New Roman"/>
+          <w:b w:val="0"/>
+          <w:i w:val="0"/>
+          <w:color w:val="000000"/>
+          <w:sz w:val="26"/>
+        </w:rPr>
+        <w:t xml:space="preserve"> Tập trung vào việc tránh các chi phí không cần thiết và tối ưu hóa ngân sách vận hành.</w:t>
+      </w:r>
+    </w:p>
+    <w:p>
+      <w:pPr>
+        <w:spacing w:line="360" w:lineRule="auto" w:before="0" w:after="120"/>
+        <w:ind w:left="360"/>
+        <w:jc w:val="both"/>
+      </w:pPr>
+      <w:r>
+        <w:rPr>
+          <w:rFonts w:ascii="Times New Roman" w:hAnsi="Times New Roman"/>
+          <w:b w:val="0"/>
+          <w:i w:val="0"/>
+          <w:color w:val="000000"/>
+          <w:sz w:val="26"/>
+        </w:rPr>
+        <w:t>Tính bền vững (Sustainability):</w:t>
+      </w:r>
+      <w:r>
+        <w:rPr>
+          <w:rFonts w:ascii="Times New Roman" w:hAnsi="Times New Roman"/>
+          <w:b w:val="0"/>
+          <w:i w:val="0"/>
+          <w:color w:val="000000"/>
+          <w:sz w:val="26"/>
+        </w:rPr>
+        <w:t xml:space="preserve"> Tối thiểu hóa tác động môi trường của việc chạy các dịch vụ đám mây (tiết kiệm năng lượng, tài nguyên phần cứng).</w:t>
       </w:r>
     </w:p>
     <w:p>
@@ -218,7 +229,124 @@
           <w:color w:val="000000"/>
           <w:sz w:val="26"/>
         </w:rPr>
-        <w:t>Sau đây là chi tiết về cấu trúc và công nghệ mà nhóm lựa chọn sử dụng trong hệ thống:</w:t>
+        <w:t xml:space="preserve">Nhận thấy các nguyên tắc này là kim chỉ nam hoàn hảo cho mục tiêu của một dự án về du lịch sinh thái bảo vệ môi trường, nhóm phát triển quyết định lựa chọn và áp dụng khung lý thuyết này để định hình thiết kế hệ thống. Nhóm đã thực tế cụ thể hóa và cải tiến khung kiến trúc này thành </w:t>
+      </w:r>
+      <w:r>
+        <w:rPr>
+          <w:rFonts w:ascii="Times New Roman" w:hAnsi="Times New Roman"/>
+          <w:b w:val="0"/>
+          <w:i w:val="0"/>
+          <w:color w:val="000000"/>
+          <w:sz w:val="26"/>
+        </w:rPr>
+        <w:t>"Mô hình Kiến trúc Web 3 Lớp triển khai trên đám mây kết hợp cơ sở dữ liệu lai"</w:t>
+      </w:r>
+      <w:r>
+        <w:rPr>
+          <w:rFonts w:ascii="Times New Roman" w:hAnsi="Times New Roman"/>
+          <w:b w:val="0"/>
+          <w:i w:val="0"/>
+          <w:color w:val="000000"/>
+          <w:sz w:val="26"/>
+        </w:rPr>
+        <w:t xml:space="preserve"> nhằm đáp ứng trọn vẹn các trụ cột thiết kế:</w:t>
+      </w:r>
+    </w:p>
+    <w:p>
+      <w:pPr>
+        <w:spacing w:line="360" w:lineRule="auto" w:before="0" w:after="120"/>
+        <w:ind w:left="360"/>
+        <w:jc w:val="both"/>
+      </w:pPr>
+      <w:r>
+        <w:rPr>
+          <w:rFonts w:ascii="Times New Roman" w:hAnsi="Times New Roman"/>
+          <w:b w:val="0"/>
+          <w:i w:val="0"/>
+          <w:color w:val="000000"/>
+          <w:sz w:val="26"/>
+        </w:rPr>
+        <w:t>Về phía Lớp giao diện (Client / Presentation Layer) và Lớp mạng (Network &amp; Routing Layer):</w:t>
+      </w:r>
+      <w:r>
+        <w:rPr>
+          <w:rFonts w:ascii="Times New Roman" w:hAnsi="Times New Roman"/>
+          <w:b w:val="0"/>
+          <w:i w:val="0"/>
+          <w:color w:val="000000"/>
+          <w:sz w:val="26"/>
+        </w:rPr>
+        <w:t xml:space="preserve"> Giao diện được phát triển bằng Angular và triển khai độc lập trên Vercel CDN để tối ưu hóa hiệu năng, giảm thời gian phản hồi, đồng thời áp dụng giao thức HTTPS bảo mật dữ liệu truyền tải.</w:t>
+      </w:r>
+    </w:p>
+    <w:p>
+      <w:pPr>
+        <w:spacing w:line="360" w:lineRule="auto" w:before="0" w:after="120"/>
+        <w:ind w:left="360"/>
+        <w:jc w:val="both"/>
+      </w:pPr>
+      <w:r>
+        <w:rPr>
+          <w:rFonts w:ascii="Times New Roman" w:hAnsi="Times New Roman"/>
+          <w:b w:val="0"/>
+          <w:i w:val="0"/>
+          <w:color w:val="000000"/>
+          <w:sz w:val="26"/>
+        </w:rPr>
+        <w:t>Về phía Lớp xử lý nghiệp vụ (Application / Backend Layer):</w:t>
+      </w:r>
+      <w:r>
+        <w:rPr>
+          <w:rFonts w:ascii="Times New Roman" w:hAnsi="Times New Roman"/>
+          <w:b w:val="0"/>
+          <w:i w:val="0"/>
+          <w:color w:val="000000"/>
+          <w:sz w:val="26"/>
+        </w:rPr>
+        <w:t xml:space="preserve"> Máy chủ backend được triển khai độc lập trên Render.com, xử lý các logic tính toán nghiệp vụ, băm bảo mật Bcrypt và xác thực không trạng thái bằng JWT để tiết kiệm RAM.</w:t>
+      </w:r>
+    </w:p>
+    <w:p>
+      <w:pPr>
+        <w:spacing w:line="360" w:lineRule="auto" w:before="0" w:after="120"/>
+        <w:ind w:left="360"/>
+        <w:jc w:val="both"/>
+      </w:pPr>
+      <w:r>
+        <w:rPr>
+          <w:rFonts w:ascii="Times New Roman" w:hAnsi="Times New Roman"/>
+          <w:b w:val="0"/>
+          <w:i w:val="0"/>
+          <w:color w:val="000000"/>
+          <w:sz w:val="26"/>
+        </w:rPr>
+        <w:t>Về phía Lớp lưu trữ dữ liệu (Data &amp; Caching Layer):</w:t>
+      </w:r>
+      <w:r>
+        <w:rPr>
+          <w:rFonts w:ascii="Times New Roman" w:hAnsi="Times New Roman"/>
+          <w:b w:val="0"/>
+          <w:i w:val="0"/>
+          <w:color w:val="000000"/>
+          <w:sz w:val="26"/>
+        </w:rPr>
+        <w:t xml:space="preserve"> Nhóm sử dụng cơ sở dữ liệu PostgreSQL đặt trên Supabase Cloud để đảm bảo tính an toàn giao dịch ACID cho dòng tiền ví điện tử, đồng thời tích hợp tính năng lai JSONB để lưu lịch trình linh hoạt, giảm số lượng truy vấn phức tạp và tiết kiệm tài nguyên xử lý của máy chủ hướng tới tiêu chuẩn phát triển phần mềm bền vững (Green Software).</w:t>
+      </w:r>
+    </w:p>
+    <w:p>
+      <w:pPr>
+        <w:spacing w:line="360" w:lineRule="auto" w:before="0" w:after="120"/>
+        <w:jc w:val="both"/>
+      </w:pPr>
+      <w:r>
+        <w:rPr>
+          <w:rFonts w:ascii="Times New Roman" w:hAnsi="Times New Roman"/>
+          <w:b w:val="0"/>
+          <w:i w:val="0"/>
+          <w:color w:val="000000"/>
+          <w:sz w:val="26"/>
+        </w:rPr>
+        <w:t>Sau đây là chi tiết về cấu trúc và công nghệ cụ thể được nhóm lựa chọn và áp dụng trong hệ thống:</w:t>
       </w:r>
     </w:p>
     <w:p>

</xml_diff>

<commit_message>
doc: finalize Chuong 2 with Traditional 3-Tier Architecture in intro
</commit_message>
<xml_diff>
--- a/Chuong_2_Cong_Nghe_Su_Dung_Final.docx
+++ b/Chuong_2_Cong_Nghe_Su_Dung_Final.docx
@@ -31,7 +31,7 @@
           <w:color w:val="000000"/>
           <w:sz w:val="26"/>
         </w:rPr>
-        <w:t xml:space="preserve">Sau quá trình học tập, tìm kiếm tài liệu và tham khảo các tiêu chuẩn thiết kế kiến trúc hệ thống hiện đại trên nền tảng đám mây, nhóm phát triển xác định được khung cơ sở lý thuyết định hướng thiết kế cho GreenSteps là </w:t>
+        <w:t xml:space="preserve">Sau quá trình học tập, tìm kiếm tài liệu và tham khảo cấu trúc các trang web thực tế, nhóm phát triển xác định được một khung cơ sở lý thuyết về cấu trúc web tiêu chuẩn là </w:t>
       </w:r>
       <w:r>
         <w:rPr>
@@ -41,7 +41,7 @@
           <w:color w:val="000000"/>
           <w:sz w:val="26"/>
         </w:rPr>
-        <w:t>Khung kiến trúc AWS Well-Architected</w:t>
+        <w:t>Kiến trúc Web 3 lớp truyền thống</w:t>
       </w:r>
       <w:r>
         <w:rPr>
@@ -51,7 +51,7 @@
           <w:color w:val="000000"/>
           <w:sz w:val="26"/>
         </w:rPr>
-        <w:t xml:space="preserve"> (AWS Well-Architected Framework). Khung lý thuyết tiêu chuẩn này được Amazon Web Services xây dựng dựa trên 6 trụ cột cốt lõi bao gồm:</w:t>
+        <w:t xml:space="preserve"> (3-Tier Architecture). Khung lý thuyết này phân chia hệ thống thành 3 thành phần chính độc lập:</w:t>
       </w:r>
     </w:p>
     <w:p>
@@ -68,7 +68,7 @@
           <w:color w:val="000000"/>
           <w:sz w:val="26"/>
         </w:rPr>
-        <w:t>Vận hành xuất sắc (Operational Excellence):</w:t>
+        <w:t>Lớp trình diễn (Presentation Layer):</w:t>
       </w:r>
       <w:r>
         <w:rPr>
@@ -78,7 +78,7 @@
           <w:color w:val="000000"/>
           <w:sz w:val="26"/>
         </w:rPr>
-        <w:t xml:space="preserve"> Tập trung vào việc chạy và giám sát hệ thống để mang lại giá trị kinh doanh, liên tục cải tiến quy trình.</w:t>
+        <w:t xml:space="preserve"> Đảm nhiệm việc hiển thị giao diện và nhận tương tác từ người dùng.</w:t>
       </w:r>
     </w:p>
     <w:p>
@@ -95,7 +95,7 @@
           <w:color w:val="000000"/>
           <w:sz w:val="26"/>
         </w:rPr>
-        <w:t>Bảo mật (Security):</w:t>
+        <w:t>Lớp logic nghiệp vụ (Application Layer):</w:t>
       </w:r>
       <w:r>
         <w:rPr>
@@ -105,7 +105,7 @@
           <w:color w:val="000000"/>
           <w:sz w:val="26"/>
         </w:rPr>
-        <w:t xml:space="preserve"> Bảo vệ thông tin, dữ liệu và tài sản hệ thống bằng các biện pháp kiểm soát và quản lý đặc quyền.</w:t>
+        <w:t xml:space="preserve"> Xử lý các quy tắc nghiệp vụ và tính toán logic của hệ thống.</w:t>
       </w:r>
     </w:p>
     <w:p>
@@ -122,7 +122,7 @@
           <w:color w:val="000000"/>
           <w:sz w:val="26"/>
         </w:rPr>
-        <w:t>Độ tin cậy (Reliability):</w:t>
+        <w:t>Lớp dữ liệu (Data Layer):</w:t>
       </w:r>
       <w:r>
         <w:rPr>
@@ -132,7 +132,43 @@
           <w:color w:val="000000"/>
           <w:sz w:val="26"/>
         </w:rPr>
-        <w:t xml:space="preserve"> Đảm bảo hệ thống có khả năng phục hồi sau các sự cố gián đoạn và tự động đáp ứng nhu cầu tài nguyên.</w:t>
+        <w:t xml:space="preserve"> Quản lý việc lưu trữ, truy xuất và duy trì tính toàn vẹn của cơ sở dữ liệu.</w:t>
+      </w:r>
+    </w:p>
+    <w:p>
+      <w:pPr>
+        <w:spacing w:line="360" w:lineRule="auto" w:before="0" w:after="120"/>
+        <w:jc w:val="both"/>
+      </w:pPr>
+      <w:r>
+        <w:rPr>
+          <w:rFonts w:ascii="Times New Roman" w:hAnsi="Times New Roman"/>
+          <w:b w:val="0"/>
+          <w:i w:val="0"/>
+          <w:color w:val="000000"/>
+          <w:sz w:val="26"/>
+        </w:rPr>
+        <w:t xml:space="preserve">Nhận thấy mô hình truyền thống này là nền tảng vững chắc để phát triển các ứng dụng web ổn định, nhóm quyết định lựa chọn và cải tiến mô hình này thành </w:t>
+      </w:r>
+      <w:r>
+        <w:rPr>
+          <w:rFonts w:ascii="Times New Roman" w:hAnsi="Times New Roman"/>
+          <w:b w:val="0"/>
+          <w:i w:val="0"/>
+          <w:color w:val="000000"/>
+          <w:sz w:val="26"/>
+        </w:rPr>
+        <w:t>"Mô hình Kiến trúc Web 3 Lớp kết hợp Dịch vụ RESTful và Cơ sở Dữ liệu Lai"</w:t>
+      </w:r>
+      <w:r>
+        <w:rPr>
+          <w:rFonts w:ascii="Times New Roman" w:hAnsi="Times New Roman"/>
+          <w:b w:val="0"/>
+          <w:i w:val="0"/>
+          <w:color w:val="000000"/>
+          <w:sz w:val="26"/>
+        </w:rPr>
+        <w:t xml:space="preserve"> (3-Tier Web Architecture with RESTful Services and Hybrid Relational-Document Database Framework) nhằm đảm bảo sự đồng nhất tuyệt đối với mục tiêu tối ưu hóa trải nghiệm người dùng, phù hợp với phạm vi phát triển sản phẩm du lịch sinh thái và khả năng kỹ thuật thực tế của nhóm:</w:t>
       </w:r>
     </w:p>
     <w:p>
@@ -149,17 +185,7 @@
           <w:color w:val="000000"/>
           <w:sz w:val="26"/>
         </w:rPr>
-        <w:t>Hiệu năng hiệu quả (Performance Efficiency):</w:t>
-      </w:r>
-      <w:r>
-        <w:rPr>
-          <w:rFonts w:ascii="Times New Roman" w:hAnsi="Times New Roman"/>
-          <w:b w:val="0"/>
-          <w:i w:val="0"/>
-          <w:color w:val="000000"/>
-          <w:sz w:val="26"/>
-        </w:rPr>
-        <w:t xml:space="preserve"> Sử dụng tài nguyên tính toán hiệu quả để đáp ứng các yêu cầu hệ thống và duy trì hiệu quả khi công nghệ thay đổi.</w:t>
+        <w:t>Bằng việc tích hợp các dịch vụ RESTful API phi trạng thái ở giữa, Frontend và Backend có thể giao tiếp mượt mà qua các gói tin JSON, giúp giảm tải xử lý và tăng tốc độ tải trang SPA.</w:t>
       </w:r>
     </w:p>
     <w:p>
@@ -176,161 +202,7 @@
           <w:color w:val="000000"/>
           <w:sz w:val="26"/>
         </w:rPr>
-        <w:t>Tối ưu hóa chi phí (Cost Optimization):</w:t>
-      </w:r>
-      <w:r>
-        <w:rPr>
-          <w:rFonts w:ascii="Times New Roman" w:hAnsi="Times New Roman"/>
-          <w:b w:val="0"/>
-          <w:i w:val="0"/>
-          <w:color w:val="000000"/>
-          <w:sz w:val="26"/>
-        </w:rPr>
-        <w:t xml:space="preserve"> Tập trung vào việc tránh các chi phí không cần thiết và tối ưu hóa ngân sách vận hành.</w:t>
-      </w:r>
-    </w:p>
-    <w:p>
-      <w:pPr>
-        <w:spacing w:line="360" w:lineRule="auto" w:before="0" w:after="120"/>
-        <w:ind w:left="360"/>
-        <w:jc w:val="both"/>
-      </w:pPr>
-      <w:r>
-        <w:rPr>
-          <w:rFonts w:ascii="Times New Roman" w:hAnsi="Times New Roman"/>
-          <w:b w:val="0"/>
-          <w:i w:val="0"/>
-          <w:color w:val="000000"/>
-          <w:sz w:val="26"/>
-        </w:rPr>
-        <w:t>Tính bền vững (Sustainability):</w:t>
-      </w:r>
-      <w:r>
-        <w:rPr>
-          <w:rFonts w:ascii="Times New Roman" w:hAnsi="Times New Roman"/>
-          <w:b w:val="0"/>
-          <w:i w:val="0"/>
-          <w:color w:val="000000"/>
-          <w:sz w:val="26"/>
-        </w:rPr>
-        <w:t xml:space="preserve"> Tối thiểu hóa tác động môi trường của việc chạy các dịch vụ đám mây (tiết kiệm năng lượng, tài nguyên phần cứng).</w:t>
-      </w:r>
-    </w:p>
-    <w:p>
-      <w:pPr>
-        <w:spacing w:line="360" w:lineRule="auto" w:before="0" w:after="120"/>
-        <w:jc w:val="both"/>
-      </w:pPr>
-      <w:r>
-        <w:rPr>
-          <w:rFonts w:ascii="Times New Roman" w:hAnsi="Times New Roman"/>
-          <w:b w:val="0"/>
-          <w:i w:val="0"/>
-          <w:color w:val="000000"/>
-          <w:sz w:val="26"/>
-        </w:rPr>
-        <w:t xml:space="preserve">Nhận thấy các nguyên tắc này là kim chỉ nam hoàn hảo cho mục tiêu của một dự án về du lịch sinh thái bảo vệ môi trường, nhóm phát triển quyết định lựa chọn và áp dụng khung lý thuyết này để định hình thiết kế hệ thống. Nhóm đã thực tế cụ thể hóa và cải tiến khung kiến trúc này thành </w:t>
-      </w:r>
-      <w:r>
-        <w:rPr>
-          <w:rFonts w:ascii="Times New Roman" w:hAnsi="Times New Roman"/>
-          <w:b w:val="0"/>
-          <w:i w:val="0"/>
-          <w:color w:val="000000"/>
-          <w:sz w:val="26"/>
-        </w:rPr>
-        <w:t>"Mô hình Kiến trúc Web 3 Lớp triển khai trên đám mây kết hợp cơ sở dữ liệu lai"</w:t>
-      </w:r>
-      <w:r>
-        <w:rPr>
-          <w:rFonts w:ascii="Times New Roman" w:hAnsi="Times New Roman"/>
-          <w:b w:val="0"/>
-          <w:i w:val="0"/>
-          <w:color w:val="000000"/>
-          <w:sz w:val="26"/>
-        </w:rPr>
-        <w:t xml:space="preserve"> nhằm đáp ứng trọn vẹn các trụ cột thiết kế:</w:t>
-      </w:r>
-    </w:p>
-    <w:p>
-      <w:pPr>
-        <w:spacing w:line="360" w:lineRule="auto" w:before="0" w:after="120"/>
-        <w:ind w:left="360"/>
-        <w:jc w:val="both"/>
-      </w:pPr>
-      <w:r>
-        <w:rPr>
-          <w:rFonts w:ascii="Times New Roman" w:hAnsi="Times New Roman"/>
-          <w:b w:val="0"/>
-          <w:i w:val="0"/>
-          <w:color w:val="000000"/>
-          <w:sz w:val="26"/>
-        </w:rPr>
-        <w:t>Về phía Lớp giao diện (Client / Presentation Layer) và Lớp mạng (Network &amp; Routing Layer):</w:t>
-      </w:r>
-      <w:r>
-        <w:rPr>
-          <w:rFonts w:ascii="Times New Roman" w:hAnsi="Times New Roman"/>
-          <w:b w:val="0"/>
-          <w:i w:val="0"/>
-          <w:color w:val="000000"/>
-          <w:sz w:val="26"/>
-        </w:rPr>
-        <w:t xml:space="preserve"> Giao diện được phát triển bằng Angular và triển khai độc lập trên Vercel CDN để tối ưu hóa hiệu năng, giảm thời gian phản hồi, đồng thời áp dụng giao thức HTTPS bảo mật dữ liệu truyền tải.</w:t>
-      </w:r>
-    </w:p>
-    <w:p>
-      <w:pPr>
-        <w:spacing w:line="360" w:lineRule="auto" w:before="0" w:after="120"/>
-        <w:ind w:left="360"/>
-        <w:jc w:val="both"/>
-      </w:pPr>
-      <w:r>
-        <w:rPr>
-          <w:rFonts w:ascii="Times New Roman" w:hAnsi="Times New Roman"/>
-          <w:b w:val="0"/>
-          <w:i w:val="0"/>
-          <w:color w:val="000000"/>
-          <w:sz w:val="26"/>
-        </w:rPr>
-        <w:t>Về phía Lớp xử lý nghiệp vụ (Application / Backend Layer):</w:t>
-      </w:r>
-      <w:r>
-        <w:rPr>
-          <w:rFonts w:ascii="Times New Roman" w:hAnsi="Times New Roman"/>
-          <w:b w:val="0"/>
-          <w:i w:val="0"/>
-          <w:color w:val="000000"/>
-          <w:sz w:val="26"/>
-        </w:rPr>
-        <w:t xml:space="preserve"> Máy chủ backend được triển khai độc lập trên Render.com, xử lý các logic tính toán nghiệp vụ, băm bảo mật Bcrypt và xác thực không trạng thái bằng JWT để tiết kiệm RAM.</w:t>
-      </w:r>
-    </w:p>
-    <w:p>
-      <w:pPr>
-        <w:spacing w:line="360" w:lineRule="auto" w:before="0" w:after="120"/>
-        <w:ind w:left="360"/>
-        <w:jc w:val="both"/>
-      </w:pPr>
-      <w:r>
-        <w:rPr>
-          <w:rFonts w:ascii="Times New Roman" w:hAnsi="Times New Roman"/>
-          <w:b w:val="0"/>
-          <w:i w:val="0"/>
-          <w:color w:val="000000"/>
-          <w:sz w:val="26"/>
-        </w:rPr>
-        <w:t>Về phía Lớp lưu trữ dữ liệu (Data &amp; Caching Layer):</w:t>
-      </w:r>
-      <w:r>
-        <w:rPr>
-          <w:rFonts w:ascii="Times New Roman" w:hAnsi="Times New Roman"/>
-          <w:b w:val="0"/>
-          <w:i w:val="0"/>
-          <w:color w:val="000000"/>
-          <w:sz w:val="26"/>
-        </w:rPr>
-        <w:t xml:space="preserve"> Nhóm sử dụng cơ sở dữ liệu PostgreSQL đặt trên Supabase Cloud để đảm bảo tính an toàn giao dịch ACID cho dòng tiền ví điện tử, đồng thời tích hợp tính năng lai JSONB để lưu lịch trình linh hoạt, giảm số lượng truy vấn phức tạp và tiết kiệm tài nguyên xử lý của máy chủ hướng tới tiêu chuẩn phát triển phần mềm bền vững (Green Software).</w:t>
+        <w:t>Bằng việc tích hợp tính năng JSONB của PostgreSQL để làm cơ sở dữ liệu lai, nhóm có thể lưu trữ các cấu trúc dữ liệu lịch trình phức tạp và thay đổi linh hoạt ngay trong cơ sở dữ liệu quan hệ mà không cần phải thiết kế quá nhiều bảng phụ phức tạp.</w:t>
       </w:r>
     </w:p>
     <w:p>

</xml_diff>